<commit_message>
docs: update speaker notes and add Vibe Coding presentation
Co-Authored-By: Claude Sonnet 5 <noreply@anthropic.com>
</commit_message>
<xml_diff>
--- a/docs/TCA-notes.docx
+++ b/docs/TCA-notes.docx
@@ -1,6 +1,6 @@
 
 <file path=word/document.xml><?xml version="1.0" encoding="utf-8"?>
-<w:document xmlns:wpc="http://schemas.microsoft.com/office/word/2010/wordprocessingCanvas" xmlns:cx="http://schemas.microsoft.com/office/drawing/2014/chartex" xmlns:cx1="http://schemas.microsoft.com/office/drawing/2015/9/8/chartex" xmlns:cx2="http://schemas.microsoft.com/office/drawing/2015/10/21/chartex" xmlns:cx3="http://schemas.microsoft.com/office/drawing/2016/5/9/chartex" xmlns:cx4="http://schemas.microsoft.com/office/drawing/2016/5/10/chartex" xmlns:cx5="http://schemas.microsoft.com/office/drawing/2016/5/11/chartex" xmlns:cx6="http://schemas.microsoft.com/office/drawing/2016/5/12/chartex" xmlns:cx7="http://schemas.microsoft.com/office/drawing/2016/5/13/chartex" xmlns:cx8="http://schemas.microsoft.com/office/drawing/2016/5/14/chartex" xmlns:mc="http://schemas.openxmlformats.org/markup-compatibility/2006" xmlns:m="http://schemas.openxmlformats.org/officeDocument/2006/math" xmlns:aink="http://schemas.microsoft.com/office/drawing/2016/ink" xmlns:am3d="http://schemas.microsoft.com/office/drawing/2017/model3d" xmlns:oel="http://schemas.microsoft.com/office/2019/extlst" xmlns:r="http://schemas.openxmlformats.org/officeDocument/2006/relationships" xmlns:wp14="http://schemas.microsoft.com/office/word/2010/wordprocessingDrawing" xmlns:wp="http://schemas.openxmlformats.org/drawingml/2006/wordprocessingDrawing" xmlns:wpg="http://schemas.microsoft.com/office/word/2010/wordprocessingGroup" xmlns:wpi="http://schemas.microsoft.com/office/word/2010/wordprocessingInk" xmlns:wps="http://schemas.microsoft.com/office/word/2010/wordprocessingShape" xmlns:o="urn:schemas-microsoft-com:office:office" xmlns:v="urn:schemas-microsoft-com:vml" xmlns:w10="urn:schemas-microsoft-com:office:word" xmlns:w="http://schemas.openxmlformats.org/wordprocessingml/2006/main" xmlns:w14="http://schemas.microsoft.com/office/word/2010/wordml" xmlns:w15="http://schemas.microsoft.com/office/word/2012/wordml" xmlns:w16cex="http://schemas.microsoft.com/office/word/2018/wordml/cex" xmlns:w16cid="http://schemas.microsoft.com/office/word/2016/wordml/cid" xmlns:w16="http://schemas.microsoft.com/office/word/2018/wordml" xmlns:w16sdtdh="http://schemas.microsoft.com/office/word/2020/wordml/sdtdatahash" xmlns:w16sdtfl="http://schemas.microsoft.com/office/word/2024/wordml/sdtformatlock" xmlns:w16se="http://schemas.microsoft.com/office/word/2015/wordml/symex" xmlns:w16du="http://schemas.microsoft.com/office/word/2023/wordml/word16du" xmlns:wne="http://schemas.microsoft.com/office/word/2006/wordml" mc:Ignorable="w14 w15 w16se w16cid w16 w16cex w16sdtdh w16sdtfl w16du wp14">
+<w:document xmlns:wpc="http://schemas.microsoft.com/office/word/2010/wordprocessingCanvas" xmlns:cx="http://schemas.microsoft.com/office/drawing/2014/chartex" xmlns:cx1="http://schemas.microsoft.com/office/drawing/2015/9/8/chartex" xmlns:cx2="http://schemas.microsoft.com/office/drawing/2015/10/21/chartex" xmlns:cx3="http://schemas.microsoft.com/office/drawing/2016/5/9/chartex" xmlns:cx4="http://schemas.microsoft.com/office/drawing/2016/5/10/chartex" xmlns:cx5="http://schemas.microsoft.com/office/drawing/2016/5/11/chartex" xmlns:cx6="http://schemas.microsoft.com/office/drawing/2016/5/12/chartex" xmlns:cx7="http://schemas.microsoft.com/office/drawing/2016/5/13/chartex" xmlns:cx8="http://schemas.microsoft.com/office/drawing/2016/5/14/chartex" xmlns:mc="http://schemas.openxmlformats.org/markup-compatibility/2006" xmlns:m="http://schemas.openxmlformats.org/officeDocument/2006/math" xmlns:aink="http://schemas.microsoft.com/office/drawing/2016/ink" xmlns:am3d="http://schemas.microsoft.com/office/drawing/2017/model3d" xmlns:oel="http://schemas.microsoft.com/office/2019/extlst" xmlns:r="http://schemas.openxmlformats.org/officeDocument/2006/relationships" xmlns:wp14="http://schemas.microsoft.com/office/word/2010/wordprocessingDrawing" xmlns:wp="http://schemas.openxmlformats.org/drawingml/2006/wordprocessingDrawing" xmlns:wpg="http://schemas.microsoft.com/office/word/2010/wordprocessingGroup" xmlns:wpi="http://schemas.microsoft.com/office/word/2010/wordprocessingInk" xmlns:wps="http://schemas.microsoft.com/office/word/2010/wordprocessingShape" xmlns:o="urn:schemas-microsoft-com:office:office" xmlns:v="urn:schemas-microsoft-com:vml" xmlns:w10="urn:schemas-microsoft-com:office:word" xmlns:w="http://schemas.openxmlformats.org/wordprocessingml/2006/main" xmlns:w14="http://schemas.microsoft.com/office/word/2010/wordml" xmlns:w15="http://schemas.microsoft.com/office/word/2012/wordml" xmlns:w16cei="http://schemas.microsoft.com/office/word/2026/wordml/cei" xmlns:w16cex="http://schemas.microsoft.com/office/word/2018/wordml/cex" xmlns:w16cid="http://schemas.microsoft.com/office/word/2016/wordml/cid" xmlns:w16="http://schemas.microsoft.com/office/word/2018/wordml" xmlns:w16sdtdh="http://schemas.microsoft.com/office/word/2020/wordml/sdtdatahash" xmlns:w16sdtfl="http://schemas.microsoft.com/office/word/2024/wordml/sdtformatlock" xmlns:w16se="http://schemas.microsoft.com/office/word/2015/wordml/symex" xmlns:w16du="http://schemas.microsoft.com/office/word/2023/wordml/word16du" xmlns:wne="http://schemas.microsoft.com/office/word/2006/wordml" mc:Ignorable="w14 w15 w16se w16cid w16 w16cex w16sdtdh w16sdtfl w16du wp14">
   <w:body>
     <w:p>
       <w:r>
@@ -1226,23 +1226,7 @@
                 <w:rFonts w:ascii="Consolas" w:hAnsi="Consolas" w:cs="Consolas"/>
                 <w:sz w:val="18"/>
               </w:rPr>
-              <w:t xml:space="preserve"> + </w:t>
-            </w:r>
-            <w:proofErr w:type="gramStart"/>
-            <w:r>
-              <w:rPr>
-                <w:rFonts w:ascii="Consolas" w:hAnsi="Consolas" w:cs="Consolas"/>
-                <w:sz w:val="18"/>
-              </w:rPr>
-              <w:t>SQLite  (</w:t>
-            </w:r>
-            <w:proofErr w:type="gramEnd"/>
-            <w:r>
-              <w:rPr>
-                <w:rFonts w:ascii="Consolas" w:hAnsi="Consolas" w:cs="Consolas"/>
-                <w:sz w:val="18"/>
-              </w:rPr>
-              <w:t>main.py, models.py, schemas.py, database.py, ai.py)</w:t>
+              <w:t xml:space="preserve"> + SQLite</w:t>
             </w:r>
             <w:r>
               <w:rPr>
@@ -1250,48 +1234,7 @@
                 <w:sz w:val="18"/>
               </w:rPr>
               <w:br/>
-              <w:t xml:space="preserve">frontend/   React + TypeScript + Vite + </w:t>
-            </w:r>
-            <w:proofErr w:type="gramStart"/>
-            <w:r>
-              <w:rPr>
-                <w:rFonts w:ascii="Consolas" w:hAnsi="Consolas" w:cs="Consolas"/>
-                <w:sz w:val="18"/>
-              </w:rPr>
-              <w:t>Tailwind  (</w:t>
-            </w:r>
-            <w:proofErr w:type="spellStart"/>
-            <w:proofErr w:type="gramEnd"/>
-            <w:r>
-              <w:rPr>
-                <w:rFonts w:ascii="Consolas" w:hAnsi="Consolas" w:cs="Consolas"/>
-                <w:sz w:val="18"/>
-              </w:rPr>
-              <w:t>App.tsx</w:t>
-            </w:r>
-            <w:proofErr w:type="spellEnd"/>
-            <w:r>
-              <w:rPr>
-                <w:rFonts w:ascii="Consolas" w:hAnsi="Consolas" w:cs="Consolas"/>
-                <w:sz w:val="18"/>
-              </w:rPr>
-              <w:t xml:space="preserve">, </w:t>
-            </w:r>
-            <w:proofErr w:type="spellStart"/>
-            <w:r>
-              <w:rPr>
-                <w:rFonts w:ascii="Consolas" w:hAnsi="Consolas" w:cs="Consolas"/>
-                <w:sz w:val="18"/>
-              </w:rPr>
-              <w:t>api.ts</w:t>
-            </w:r>
-            <w:proofErr w:type="spellEnd"/>
-            <w:r>
-              <w:rPr>
-                <w:rFonts w:ascii="Consolas" w:hAnsi="Consolas" w:cs="Consolas"/>
-                <w:sz w:val="18"/>
-              </w:rPr>
-              <w:t>, components/)</w:t>
+              <w:t>frontend/   React + TypeScript + Vite + Tailwind</w:t>
             </w:r>
             <w:r>
               <w:rPr>
@@ -1505,23 +1448,7 @@
                 <w:rFonts w:ascii="Consolas" w:hAnsi="Consolas" w:cs="Consolas"/>
                 <w:sz w:val="18"/>
               </w:rPr>
-              <w:t xml:space="preserve"> (</w:t>
-            </w:r>
-            <w:proofErr w:type="spellStart"/>
-            <w:r>
-              <w:rPr>
-                <w:rFonts w:ascii="Consolas" w:hAnsi="Consolas" w:cs="Consolas"/>
-                <w:sz w:val="18"/>
-              </w:rPr>
-              <w:t>uv</w:t>
-            </w:r>
-            <w:proofErr w:type="spellEnd"/>
-            <w:r>
-              <w:rPr>
-                <w:rFonts w:ascii="Consolas" w:hAnsi="Consolas" w:cs="Consolas"/>
-                <w:sz w:val="18"/>
-              </w:rPr>
-              <w:t>) + frontend deps (</w:t>
+              <w:t xml:space="preserve"> (uv) + frontend deps (</w:t>
             </w:r>
             <w:proofErr w:type="spellStart"/>
             <w:r>
@@ -1821,14 +1748,15 @@
         <w:tblLook w:val="04A0" w:firstRow="1" w:lastRow="0" w:firstColumn="1" w:lastColumn="0" w:noHBand="0" w:noVBand="1"/>
       </w:tblPr>
       <w:tblGrid>
-        <w:gridCol w:w="2880"/>
-        <w:gridCol w:w="2880"/>
-        <w:gridCol w:w="2880"/>
+        <w:gridCol w:w="2341"/>
+        <w:gridCol w:w="3750"/>
+        <w:gridCol w:w="1026"/>
+        <w:gridCol w:w="2233"/>
       </w:tblGrid>
       <w:tr>
         <w:tc>
           <w:tcPr>
-            <w:tcW w:w="2880" w:type="dxa"/>
+            <w:tcW w:w="2341" w:type="dxa"/>
             <w:shd w:val="clear" w:color="auto" w:fill="5E02D1"/>
           </w:tcPr>
           <w:p>
@@ -1845,7 +1773,7 @@
         </w:tc>
         <w:tc>
           <w:tcPr>
-            <w:tcW w:w="2880" w:type="dxa"/>
+            <w:tcW w:w="3750" w:type="dxa"/>
             <w:shd w:val="clear" w:color="auto" w:fill="5E02D1"/>
           </w:tcPr>
           <w:p>
@@ -1862,7 +1790,7 @@
         </w:tc>
         <w:tc>
           <w:tcPr>
-            <w:tcW w:w="2880" w:type="dxa"/>
+            <w:tcW w:w="1026" w:type="dxa"/>
             <w:shd w:val="clear" w:color="auto" w:fill="5E02D1"/>
           </w:tcPr>
           <w:p>
@@ -1877,91 +1805,149 @@
             </w:r>
           </w:p>
         </w:tc>
+        <w:tc>
+          <w:tcPr>
+            <w:tcW w:w="2233" w:type="dxa"/>
+            <w:shd w:val="clear" w:color="auto" w:fill="5E02D1"/>
+          </w:tcPr>
+          <w:p>
+            <w:pPr>
+              <w:rPr>
+                <w:b/>
+                <w:bCs/>
+                <w:color w:val="FFFFFF"/>
+                <w:sz w:val="18"/>
+              </w:rPr>
+            </w:pPr>
+            <w:r>
+              <w:rPr>
+                <w:b/>
+                <w:bCs/>
+                <w:color w:val="FFFFFF"/>
+                <w:sz w:val="18"/>
+              </w:rPr>
+              <w:t>Lead</w:t>
+            </w:r>
+          </w:p>
+        </w:tc>
       </w:tr>
       <w:tr>
         <w:tc>
           <w:tcPr>
-            <w:tcW w:w="2880" w:type="dxa"/>
-            <w:shd w:val="clear" w:color="auto" w:fill="F5F0FF"/>
-          </w:tcPr>
-          <w:p>
-            <w:r>
-              <w:rPr>
-                <w:sz w:val="18"/>
-              </w:rPr>
-              <w:t>09:30</w:t>
-            </w:r>
-          </w:p>
-        </w:tc>
-        <w:tc>
-          <w:tcPr>
-            <w:tcW w:w="2880" w:type="dxa"/>
-            <w:shd w:val="clear" w:color="auto" w:fill="F5F0FF"/>
-          </w:tcPr>
-          <w:p>
-            <w:r>
-              <w:rPr>
-                <w:sz w:val="18"/>
-              </w:rPr>
-              <w:t>Welcome, setup check, the day's shape</w:t>
-            </w:r>
-          </w:p>
-        </w:tc>
-        <w:tc>
-          <w:tcPr>
-            <w:tcW w:w="2880" w:type="dxa"/>
-            <w:shd w:val="clear" w:color="auto" w:fill="F5F0FF"/>
-          </w:tcPr>
-          <w:p>
-            <w:r>
-              <w:rPr>
-                <w:sz w:val="18"/>
-              </w:rPr>
-              <w:t>30</w:t>
-            </w:r>
+            <w:tcW w:w="2341" w:type="dxa"/>
+          </w:tcPr>
+          <w:p>
+            <w:pPr>
+              <w:rPr>
+                <w:sz w:val="18"/>
+              </w:rPr>
+            </w:pPr>
+            <w:r>
+              <w:rPr>
+                <w:sz w:val="18"/>
+              </w:rPr>
+              <w:t>09:00</w:t>
+            </w:r>
+          </w:p>
+        </w:tc>
+        <w:tc>
+          <w:tcPr>
+            <w:tcW w:w="3750" w:type="dxa"/>
+          </w:tcPr>
+          <w:p>
+            <w:pPr>
+              <w:rPr>
+                <w:sz w:val="18"/>
+              </w:rPr>
+            </w:pPr>
+            <w:r>
+              <w:rPr>
+                <w:sz w:val="18"/>
+              </w:rPr>
+              <w:t>Start arriving</w:t>
+            </w:r>
+          </w:p>
+        </w:tc>
+        <w:tc>
+          <w:tcPr>
+            <w:tcW w:w="1026" w:type="dxa"/>
+          </w:tcPr>
+          <w:p>
+            <w:pPr>
+              <w:rPr>
+                <w:sz w:val="18"/>
+              </w:rPr>
+            </w:pPr>
+          </w:p>
+        </w:tc>
+        <w:tc>
+          <w:tcPr>
+            <w:tcW w:w="2233" w:type="dxa"/>
+          </w:tcPr>
+          <w:p>
+            <w:pPr>
+              <w:rPr>
+                <w:sz w:val="18"/>
+              </w:rPr>
+            </w:pPr>
           </w:p>
         </w:tc>
       </w:tr>
       <w:tr>
         <w:tc>
           <w:tcPr>
-            <w:tcW w:w="2880" w:type="dxa"/>
-            <w:shd w:val="clear" w:color="auto" w:fill="FFFFFF"/>
-          </w:tcPr>
-          <w:p>
-            <w:r>
-              <w:rPr>
-                <w:sz w:val="18"/>
-              </w:rPr>
-              <w:t>10:00</w:t>
-            </w:r>
-          </w:p>
-        </w:tc>
-        <w:tc>
-          <w:tcPr>
-            <w:tcW w:w="2880" w:type="dxa"/>
-            <w:shd w:val="clear" w:color="auto" w:fill="FFFFFF"/>
-          </w:tcPr>
-          <w:p>
-            <w:r>
-              <w:rPr>
-                <w:sz w:val="18"/>
-              </w:rPr>
-              <w:t>Section 1: Vibe Coding</w:t>
-            </w:r>
-          </w:p>
-        </w:tc>
-        <w:tc>
-          <w:tcPr>
-            <w:tcW w:w="2880" w:type="dxa"/>
-            <w:shd w:val="clear" w:color="auto" w:fill="FFFFFF"/>
-          </w:tcPr>
-          <w:p>
-            <w:r>
-              <w:rPr>
-                <w:sz w:val="18"/>
-              </w:rPr>
-              <w:t>90</w:t>
+            <w:tcW w:w="2341" w:type="dxa"/>
+          </w:tcPr>
+          <w:p>
+            <w:r>
+              <w:rPr>
+                <w:sz w:val="18"/>
+              </w:rPr>
+              <w:t>09:30</w:t>
+            </w:r>
+          </w:p>
+        </w:tc>
+        <w:tc>
+          <w:tcPr>
+            <w:tcW w:w="3750" w:type="dxa"/>
+          </w:tcPr>
+          <w:p>
+            <w:r>
+              <w:rPr>
+                <w:sz w:val="18"/>
+              </w:rPr>
+              <w:t>Welcome, introduction. Setup check, the day's shape</w:t>
+            </w:r>
+          </w:p>
+        </w:tc>
+        <w:tc>
+          <w:tcPr>
+            <w:tcW w:w="1026" w:type="dxa"/>
+          </w:tcPr>
+          <w:p>
+            <w:r>
+              <w:rPr>
+                <w:sz w:val="18"/>
+              </w:rPr>
+              <w:t>30</w:t>
+            </w:r>
+          </w:p>
+        </w:tc>
+        <w:tc>
+          <w:tcPr>
+            <w:tcW w:w="2233" w:type="dxa"/>
+          </w:tcPr>
+          <w:p>
+            <w:pPr>
+              <w:rPr>
+                <w:sz w:val="18"/>
+              </w:rPr>
+            </w:pPr>
+            <w:r>
+              <w:rPr>
+                <w:sz w:val="18"/>
+              </w:rPr>
+              <w:t>Adair and Paul</w:t>
             </w:r>
           </w:p>
         </w:tc>
@@ -1969,43 +1955,73 @@
       <w:tr>
         <w:tc>
           <w:tcPr>
-            <w:tcW w:w="2880" w:type="dxa"/>
-            <w:shd w:val="clear" w:color="auto" w:fill="F5F0FF"/>
-          </w:tcPr>
-          <w:p>
-            <w:r>
-              <w:rPr>
-                <w:sz w:val="18"/>
-              </w:rPr>
-              <w:t>11:30</w:t>
-            </w:r>
-          </w:p>
-        </w:tc>
-        <w:tc>
-          <w:tcPr>
-            <w:tcW w:w="2880" w:type="dxa"/>
-            <w:shd w:val="clear" w:color="auto" w:fill="F5F0FF"/>
-          </w:tcPr>
-          <w:p>
-            <w:r>
-              <w:rPr>
-                <w:sz w:val="18"/>
-              </w:rPr>
-              <w:t>Break</w:t>
-            </w:r>
-          </w:p>
-        </w:tc>
-        <w:tc>
-          <w:tcPr>
-            <w:tcW w:w="2880" w:type="dxa"/>
-            <w:shd w:val="clear" w:color="auto" w:fill="F5F0FF"/>
-          </w:tcPr>
-          <w:p>
+            <w:tcW w:w="2341" w:type="dxa"/>
+          </w:tcPr>
+          <w:p>
+            <w:pPr>
+              <w:rPr>
+                <w:sz w:val="18"/>
+              </w:rPr>
+            </w:pPr>
+            <w:r>
+              <w:rPr>
+                <w:sz w:val="18"/>
+              </w:rPr>
+              <w:t>09:45</w:t>
+            </w:r>
+          </w:p>
+        </w:tc>
+        <w:tc>
+          <w:tcPr>
+            <w:tcW w:w="3750" w:type="dxa"/>
+          </w:tcPr>
+          <w:p>
+            <w:pPr>
+              <w:rPr>
+                <w:sz w:val="18"/>
+              </w:rPr>
+            </w:pPr>
+            <w:r>
+              <w:rPr>
+                <w:sz w:val="18"/>
+              </w:rPr>
+              <w:t>Life of the engineers have changed</w:t>
+            </w:r>
+          </w:p>
+        </w:tc>
+        <w:tc>
+          <w:tcPr>
+            <w:tcW w:w="1026" w:type="dxa"/>
+          </w:tcPr>
+          <w:p>
+            <w:pPr>
+              <w:rPr>
+                <w:sz w:val="18"/>
+              </w:rPr>
+            </w:pPr>
             <w:r>
               <w:rPr>
                 <w:sz w:val="18"/>
               </w:rPr>
               <w:t>15</w:t>
+            </w:r>
+          </w:p>
+        </w:tc>
+        <w:tc>
+          <w:tcPr>
+            <w:tcW w:w="2233" w:type="dxa"/>
+          </w:tcPr>
+          <w:p>
+            <w:pPr>
+              <w:rPr>
+                <w:sz w:val="18"/>
+              </w:rPr>
+            </w:pPr>
+            <w:r>
+              <w:rPr>
+                <w:sz w:val="18"/>
+              </w:rPr>
+              <w:t>Jade</w:t>
             </w:r>
           </w:p>
         </w:tc>
@@ -2013,36 +2029,33 @@
       <w:tr>
         <w:tc>
           <w:tcPr>
-            <w:tcW w:w="2880" w:type="dxa"/>
-            <w:shd w:val="clear" w:color="auto" w:fill="FFFFFF"/>
-          </w:tcPr>
-          <w:p>
-            <w:r>
-              <w:rPr>
-                <w:sz w:val="18"/>
-              </w:rPr>
-              <w:t>11:45</w:t>
-            </w:r>
-          </w:p>
-        </w:tc>
-        <w:tc>
-          <w:tcPr>
-            <w:tcW w:w="2880" w:type="dxa"/>
-            <w:shd w:val="clear" w:color="auto" w:fill="FFFFFF"/>
-          </w:tcPr>
-          <w:p>
-            <w:r>
-              <w:rPr>
-                <w:sz w:val="18"/>
-              </w:rPr>
-              <w:t>Section 2: Vibe Engineering</w:t>
-            </w:r>
-          </w:p>
-        </w:tc>
-        <w:tc>
-          <w:tcPr>
-            <w:tcW w:w="2880" w:type="dxa"/>
-            <w:shd w:val="clear" w:color="auto" w:fill="FFFFFF"/>
+            <w:tcW w:w="2341" w:type="dxa"/>
+          </w:tcPr>
+          <w:p>
+            <w:r>
+              <w:rPr>
+                <w:sz w:val="18"/>
+              </w:rPr>
+              <w:t>10:00</w:t>
+            </w:r>
+          </w:p>
+        </w:tc>
+        <w:tc>
+          <w:tcPr>
+            <w:tcW w:w="3750" w:type="dxa"/>
+          </w:tcPr>
+          <w:p>
+            <w:r>
+              <w:rPr>
+                <w:sz w:val="18"/>
+              </w:rPr>
+              <w:t>Section 1: Vibe Coding</w:t>
+            </w:r>
+          </w:p>
+        </w:tc>
+        <w:tc>
+          <w:tcPr>
+            <w:tcW w:w="1026" w:type="dxa"/>
           </w:tcPr>
           <w:p>
             <w:r>
@@ -2051,146 +2064,290 @@
               </w:rPr>
               <w:t>90</w:t>
             </w:r>
+          </w:p>
+        </w:tc>
+        <w:tc>
+          <w:tcPr>
+            <w:tcW w:w="2233" w:type="dxa"/>
+          </w:tcPr>
+          <w:p>
+            <w:pPr>
+              <w:rPr>
+                <w:sz w:val="18"/>
+              </w:rPr>
+            </w:pPr>
           </w:p>
         </w:tc>
       </w:tr>
       <w:tr>
         <w:tc>
           <w:tcPr>
-            <w:tcW w:w="2880" w:type="dxa"/>
-            <w:shd w:val="clear" w:color="auto" w:fill="F5F0FF"/>
-          </w:tcPr>
-          <w:p>
-            <w:r>
-              <w:rPr>
-                <w:sz w:val="18"/>
-              </w:rPr>
-              <w:t>13:15</w:t>
-            </w:r>
-          </w:p>
-        </w:tc>
-        <w:tc>
-          <w:tcPr>
-            <w:tcW w:w="2880" w:type="dxa"/>
-            <w:shd w:val="clear" w:color="auto" w:fill="F5F0FF"/>
-          </w:tcPr>
-          <w:p>
-            <w:r>
-              <w:rPr>
-                <w:sz w:val="18"/>
-              </w:rPr>
-              <w:t>Lunch</w:t>
-            </w:r>
-          </w:p>
-        </w:tc>
-        <w:tc>
-          <w:tcPr>
-            <w:tcW w:w="2880" w:type="dxa"/>
-            <w:shd w:val="clear" w:color="auto" w:fill="F5F0FF"/>
-          </w:tcPr>
-          <w:p>
-            <w:r>
-              <w:rPr>
-                <w:sz w:val="18"/>
-              </w:rPr>
-              <w:t>45</w:t>
-            </w:r>
+            <w:tcW w:w="2341" w:type="dxa"/>
+          </w:tcPr>
+          <w:p>
+            <w:r>
+              <w:rPr>
+                <w:sz w:val="18"/>
+              </w:rPr>
+              <w:t>11:30</w:t>
+            </w:r>
+          </w:p>
+        </w:tc>
+        <w:tc>
+          <w:tcPr>
+            <w:tcW w:w="3750" w:type="dxa"/>
+          </w:tcPr>
+          <w:p>
+            <w:r>
+              <w:rPr>
+                <w:sz w:val="18"/>
+              </w:rPr>
+              <w:t>Break</w:t>
+            </w:r>
+          </w:p>
+        </w:tc>
+        <w:tc>
+          <w:tcPr>
+            <w:tcW w:w="1026" w:type="dxa"/>
+          </w:tcPr>
+          <w:p>
+            <w:r>
+              <w:rPr>
+                <w:sz w:val="18"/>
+              </w:rPr>
+              <w:t>15</w:t>
+            </w:r>
+          </w:p>
+        </w:tc>
+        <w:tc>
+          <w:tcPr>
+            <w:tcW w:w="2233" w:type="dxa"/>
+          </w:tcPr>
+          <w:p>
+            <w:pPr>
+              <w:rPr>
+                <w:sz w:val="18"/>
+              </w:rPr>
+            </w:pPr>
           </w:p>
         </w:tc>
       </w:tr>
       <w:tr>
         <w:tc>
           <w:tcPr>
-            <w:tcW w:w="2880" w:type="dxa"/>
-            <w:shd w:val="clear" w:color="auto" w:fill="FFFFFF"/>
-          </w:tcPr>
-          <w:p>
-            <w:r>
-              <w:rPr>
-                <w:sz w:val="18"/>
-              </w:rPr>
-              <w:t>14:00</w:t>
-            </w:r>
-          </w:p>
-        </w:tc>
-        <w:tc>
-          <w:tcPr>
-            <w:tcW w:w="2880" w:type="dxa"/>
-            <w:shd w:val="clear" w:color="auto" w:fill="FFFFFF"/>
-          </w:tcPr>
-          <w:p>
-            <w:r>
-              <w:rPr>
-                <w:sz w:val="18"/>
-              </w:rPr>
-              <w:t>Section 3: Agentic Engineering</w:t>
-            </w:r>
-          </w:p>
-        </w:tc>
-        <w:tc>
-          <w:tcPr>
-            <w:tcW w:w="2880" w:type="dxa"/>
-            <w:shd w:val="clear" w:color="auto" w:fill="FFFFFF"/>
-          </w:tcPr>
-          <w:p>
-            <w:r>
-              <w:rPr>
-                <w:sz w:val="18"/>
-              </w:rPr>
-              <w:t>105</w:t>
-            </w:r>
+            <w:tcW w:w="2341" w:type="dxa"/>
+          </w:tcPr>
+          <w:p>
+            <w:r>
+              <w:rPr>
+                <w:sz w:val="18"/>
+              </w:rPr>
+              <w:t>11:45</w:t>
+            </w:r>
+          </w:p>
+        </w:tc>
+        <w:tc>
+          <w:tcPr>
+            <w:tcW w:w="3750" w:type="dxa"/>
+          </w:tcPr>
+          <w:p>
+            <w:r>
+              <w:rPr>
+                <w:sz w:val="18"/>
+              </w:rPr>
+              <w:t>Section 2: Vibe Engineering</w:t>
+            </w:r>
+          </w:p>
+        </w:tc>
+        <w:tc>
+          <w:tcPr>
+            <w:tcW w:w="1026" w:type="dxa"/>
+          </w:tcPr>
+          <w:p>
+            <w:r>
+              <w:rPr>
+                <w:sz w:val="18"/>
+              </w:rPr>
+              <w:t>90</w:t>
+            </w:r>
+          </w:p>
+        </w:tc>
+        <w:tc>
+          <w:tcPr>
+            <w:tcW w:w="2233" w:type="dxa"/>
+          </w:tcPr>
+          <w:p>
+            <w:pPr>
+              <w:rPr>
+                <w:sz w:val="18"/>
+              </w:rPr>
+            </w:pPr>
           </w:p>
         </w:tc>
       </w:tr>
       <w:tr>
         <w:tc>
           <w:tcPr>
-            <w:tcW w:w="2880" w:type="dxa"/>
-            <w:shd w:val="clear" w:color="auto" w:fill="F5F0FF"/>
-          </w:tcPr>
-          <w:p>
-            <w:r>
-              <w:rPr>
-                <w:sz w:val="18"/>
-              </w:rPr>
-              <w:t>15:45</w:t>
-            </w:r>
-          </w:p>
-        </w:tc>
-        <w:tc>
-          <w:tcPr>
-            <w:tcW w:w="2880" w:type="dxa"/>
-            <w:shd w:val="clear" w:color="auto" w:fill="F5F0FF"/>
-          </w:tcPr>
-          <w:p>
-            <w:r>
-              <w:rPr>
-                <w:sz w:val="18"/>
-              </w:rPr>
-              <w:t>Showcase and close</w:t>
-            </w:r>
-          </w:p>
-        </w:tc>
-        <w:tc>
-          <w:tcPr>
-            <w:tcW w:w="2880" w:type="dxa"/>
-            <w:shd w:val="clear" w:color="auto" w:fill="F5F0FF"/>
-          </w:tcPr>
-          <w:p>
-            <w:r>
-              <w:rPr>
-                <w:sz w:val="18"/>
-              </w:rPr>
-              <w:t>15</w:t>
-            </w:r>
+            <w:tcW w:w="2341" w:type="dxa"/>
+          </w:tcPr>
+          <w:p>
+            <w:r>
+              <w:rPr>
+                <w:sz w:val="18"/>
+              </w:rPr>
+              <w:t>13:15</w:t>
+            </w:r>
+          </w:p>
+        </w:tc>
+        <w:tc>
+          <w:tcPr>
+            <w:tcW w:w="3750" w:type="dxa"/>
+          </w:tcPr>
+          <w:p>
+            <w:r>
+              <w:rPr>
+                <w:sz w:val="18"/>
+              </w:rPr>
+              <w:t>Lunch</w:t>
+            </w:r>
+          </w:p>
+        </w:tc>
+        <w:tc>
+          <w:tcPr>
+            <w:tcW w:w="1026" w:type="dxa"/>
+          </w:tcPr>
+          <w:p>
+            <w:r>
+              <w:rPr>
+                <w:sz w:val="18"/>
+              </w:rPr>
+              <w:t>45</w:t>
+            </w:r>
+          </w:p>
+        </w:tc>
+        <w:tc>
+          <w:tcPr>
+            <w:tcW w:w="2233" w:type="dxa"/>
+          </w:tcPr>
+          <w:p>
+            <w:pPr>
+              <w:rPr>
+                <w:sz w:val="18"/>
+              </w:rPr>
+            </w:pPr>
           </w:p>
         </w:tc>
       </w:tr>
       <w:tr>
         <w:tc>
           <w:tcPr>
-            <w:tcW w:w="2880" w:type="dxa"/>
-            <w:shd w:val="clear" w:color="auto" w:fill="FFFFFF"/>
+            <w:tcW w:w="2341" w:type="dxa"/>
+          </w:tcPr>
+          <w:p>
+            <w:r>
+              <w:rPr>
+                <w:sz w:val="18"/>
+              </w:rPr>
+              <w:t>14:00</w:t>
+            </w:r>
+          </w:p>
+        </w:tc>
+        <w:tc>
+          <w:tcPr>
+            <w:tcW w:w="3750" w:type="dxa"/>
+          </w:tcPr>
+          <w:p>
+            <w:r>
+              <w:rPr>
+                <w:sz w:val="18"/>
+              </w:rPr>
+              <w:t>Section 3: Agentic Engineering</w:t>
+            </w:r>
+          </w:p>
+        </w:tc>
+        <w:tc>
+          <w:tcPr>
+            <w:tcW w:w="1026" w:type="dxa"/>
+          </w:tcPr>
+          <w:p>
+            <w:r>
+              <w:rPr>
+                <w:sz w:val="18"/>
+              </w:rPr>
+              <w:t>105</w:t>
+            </w:r>
+          </w:p>
+        </w:tc>
+        <w:tc>
+          <w:tcPr>
+            <w:tcW w:w="2233" w:type="dxa"/>
+          </w:tcPr>
+          <w:p>
+            <w:pPr>
+              <w:rPr>
+                <w:sz w:val="18"/>
+              </w:rPr>
+            </w:pPr>
+          </w:p>
+        </w:tc>
+      </w:tr>
+      <w:tr>
+        <w:tc>
+          <w:tcPr>
+            <w:tcW w:w="2341" w:type="dxa"/>
+          </w:tcPr>
+          <w:p>
+            <w:r>
+              <w:rPr>
+                <w:sz w:val="18"/>
+              </w:rPr>
+              <w:t>15:45</w:t>
+            </w:r>
+          </w:p>
+        </w:tc>
+        <w:tc>
+          <w:tcPr>
+            <w:tcW w:w="3750" w:type="dxa"/>
+          </w:tcPr>
+          <w:p>
+            <w:r>
+              <w:rPr>
+                <w:sz w:val="18"/>
+              </w:rPr>
+              <w:t>Showcase and close</w:t>
+            </w:r>
+          </w:p>
+        </w:tc>
+        <w:tc>
+          <w:tcPr>
+            <w:tcW w:w="1026" w:type="dxa"/>
+          </w:tcPr>
+          <w:p>
+            <w:r>
+              <w:rPr>
+                <w:sz w:val="18"/>
+              </w:rPr>
+              <w:t>15</w:t>
+            </w:r>
+          </w:p>
+        </w:tc>
+        <w:tc>
+          <w:tcPr>
+            <w:tcW w:w="2233" w:type="dxa"/>
+          </w:tcPr>
+          <w:p>
+            <w:pPr>
+              <w:rPr>
+                <w:sz w:val="18"/>
+              </w:rPr>
+            </w:pPr>
+          </w:p>
+        </w:tc>
+      </w:tr>
+      <w:tr>
+        <w:tc>
+          <w:tcPr>
+            <w:tcW w:w="2341" w:type="dxa"/>
           </w:tcPr>
           <w:p>
             <w:r>
@@ -2203,8 +2360,7 @@
         </w:tc>
         <w:tc>
           <w:tcPr>
-            <w:tcW w:w="2880" w:type="dxa"/>
-            <w:shd w:val="clear" w:color="auto" w:fill="FFFFFF"/>
+            <w:tcW w:w="3750" w:type="dxa"/>
           </w:tcPr>
           <w:p>
             <w:r>
@@ -2217,8 +2373,13 @@
         </w:tc>
         <w:tc>
           <w:tcPr>
-            <w:tcW w:w="2880" w:type="dxa"/>
-            <w:shd w:val="clear" w:color="auto" w:fill="FFFFFF"/>
+            <w:tcW w:w="1026" w:type="dxa"/>
+          </w:tcPr>
+          <w:p/>
+        </w:tc>
+        <w:tc>
+          <w:tcPr>
+            <w:tcW w:w="2233" w:type="dxa"/>
           </w:tcPr>
           <w:p/>
         </w:tc>
@@ -3108,22 +3269,7 @@
                 <w:sz w:val="18"/>
               </w:rPr>
               <w:br/>
-            </w:r>
-            <w:proofErr w:type="spellStart"/>
-            <w:r>
-              <w:rPr>
-                <w:rFonts w:ascii="Consolas" w:hAnsi="Consolas" w:cs="Consolas"/>
-                <w:sz w:val="18"/>
-              </w:rPr>
-              <w:t>claude</w:t>
-            </w:r>
-            <w:proofErr w:type="spellEnd"/>
-            <w:r>
-              <w:rPr>
-                <w:rFonts w:ascii="Consolas" w:hAnsi="Consolas" w:cs="Consolas"/>
-                <w:sz w:val="18"/>
-              </w:rPr>
-              <w:t xml:space="preserve">            # Claude Code</w:t>
+              <w:t>claude            # Claude Code</w:t>
             </w:r>
             <w:r>
               <w:rPr>
@@ -9481,23 +9627,7 @@
                 <w:rFonts w:ascii="Consolas" w:hAnsi="Consolas" w:cs="Consolas"/>
                 <w:sz w:val="18"/>
               </w:rPr>
-              <w:t xml:space="preserve"> (</w:t>
-            </w:r>
-            <w:proofErr w:type="spellStart"/>
-            <w:r>
-              <w:rPr>
-                <w:rFonts w:ascii="Consolas" w:hAnsi="Consolas" w:cs="Consolas"/>
-                <w:sz w:val="18"/>
-              </w:rPr>
-              <w:t>uv</w:t>
-            </w:r>
-            <w:proofErr w:type="spellEnd"/>
-            <w:r>
-              <w:rPr>
-                <w:rFonts w:ascii="Consolas" w:hAnsi="Consolas" w:cs="Consolas"/>
-                <w:sz w:val="18"/>
-              </w:rPr>
-              <w:t>) + frontend deps (</w:t>
+              <w:t xml:space="preserve"> (uv) + frontend deps (</w:t>
             </w:r>
             <w:proofErr w:type="spellStart"/>
             <w:r>
@@ -9743,23 +9873,7 @@
                 <w:rFonts w:ascii="Consolas" w:hAnsi="Consolas" w:cs="Consolas"/>
                 <w:sz w:val="18"/>
               </w:rPr>
-              <w:t xml:space="preserve">-habits &amp;&amp; </w:t>
-            </w:r>
-            <w:proofErr w:type="spellStart"/>
-            <w:r>
-              <w:rPr>
-                <w:rFonts w:ascii="Consolas" w:hAnsi="Consolas" w:cs="Consolas"/>
-                <w:sz w:val="18"/>
-              </w:rPr>
-              <w:t>claude</w:t>
-            </w:r>
-            <w:proofErr w:type="spellEnd"/>
-            <w:r>
-              <w:rPr>
-                <w:rFonts w:ascii="Consolas" w:hAnsi="Consolas" w:cs="Consolas"/>
-                <w:sz w:val="18"/>
-              </w:rPr>
-              <w:t xml:space="preserve">          # Claude Code</w:t>
+              <w:t>-habits &amp;&amp; claude          # Claude Code</w:t>
             </w:r>
             <w:r>
               <w:rPr>
@@ -11974,7 +12088,7 @@
 </file>
 
 <file path=word/endnotes.xml><?xml version="1.0" encoding="utf-8"?>
-<w:endnotes xmlns:wpc="http://schemas.microsoft.com/office/word/2010/wordprocessingCanvas" xmlns:cx="http://schemas.microsoft.com/office/drawing/2014/chartex" xmlns:cx1="http://schemas.microsoft.com/office/drawing/2015/9/8/chartex" xmlns:cx2="http://schemas.microsoft.com/office/drawing/2015/10/21/chartex" xmlns:cx3="http://schemas.microsoft.com/office/drawing/2016/5/9/chartex" xmlns:cx4="http://schemas.microsoft.com/office/drawing/2016/5/10/chartex" xmlns:cx5="http://schemas.microsoft.com/office/drawing/2016/5/11/chartex" xmlns:cx6="http://schemas.microsoft.com/office/drawing/2016/5/12/chartex" xmlns:cx7="http://schemas.microsoft.com/office/drawing/2016/5/13/chartex" xmlns:cx8="http://schemas.microsoft.com/office/drawing/2016/5/14/chartex" xmlns:mc="http://schemas.openxmlformats.org/markup-compatibility/2006" xmlns:m="http://schemas.openxmlformats.org/officeDocument/2006/math" xmlns:aink="http://schemas.microsoft.com/office/drawing/2016/ink" xmlns:am3d="http://schemas.microsoft.com/office/drawing/2017/model3d" xmlns:oel="http://schemas.microsoft.com/office/2019/extlst" xmlns:r="http://schemas.openxmlformats.org/officeDocument/2006/relationships" xmlns:wp14="http://schemas.microsoft.com/office/word/2010/wordprocessingDrawing" xmlns:wp="http://schemas.openxmlformats.org/drawingml/2006/wordprocessingDrawing" xmlns:wpg="http://schemas.microsoft.com/office/word/2010/wordprocessingGroup" xmlns:wpi="http://schemas.microsoft.com/office/word/2010/wordprocessingInk" xmlns:wps="http://schemas.microsoft.com/office/word/2010/wordprocessingShape" xmlns:o="urn:schemas-microsoft-com:office:office" xmlns:v="urn:schemas-microsoft-com:vml" xmlns:w10="urn:schemas-microsoft-com:office:word" xmlns:w="http://schemas.openxmlformats.org/wordprocessingml/2006/main" xmlns:w14="http://schemas.microsoft.com/office/word/2010/wordml" xmlns:w15="http://schemas.microsoft.com/office/word/2012/wordml" xmlns:w16cex="http://schemas.microsoft.com/office/word/2018/wordml/cex" xmlns:w16cid="http://schemas.microsoft.com/office/word/2016/wordml/cid" xmlns:w16="http://schemas.microsoft.com/office/word/2018/wordml" xmlns:w16sdtdh="http://schemas.microsoft.com/office/word/2020/wordml/sdtdatahash" xmlns:w16sdtfl="http://schemas.microsoft.com/office/word/2024/wordml/sdtformatlock" xmlns:w16se="http://schemas.microsoft.com/office/word/2015/wordml/symex" xmlns:w16du="http://schemas.microsoft.com/office/word/2023/wordml/word16du" xmlns:wne="http://schemas.microsoft.com/office/word/2006/wordml" mc:Ignorable="w14 w15 w16se w16cid w16 w16cex w16sdtdh w16sdtfl w16du wp14">
+<w:endnotes xmlns:wpc="http://schemas.microsoft.com/office/word/2010/wordprocessingCanvas" xmlns:cx="http://schemas.microsoft.com/office/drawing/2014/chartex" xmlns:cx1="http://schemas.microsoft.com/office/drawing/2015/9/8/chartex" xmlns:cx2="http://schemas.microsoft.com/office/drawing/2015/10/21/chartex" xmlns:cx3="http://schemas.microsoft.com/office/drawing/2016/5/9/chartex" xmlns:cx4="http://schemas.microsoft.com/office/drawing/2016/5/10/chartex" xmlns:cx5="http://schemas.microsoft.com/office/drawing/2016/5/11/chartex" xmlns:cx6="http://schemas.microsoft.com/office/drawing/2016/5/12/chartex" xmlns:cx7="http://schemas.microsoft.com/office/drawing/2016/5/13/chartex" xmlns:cx8="http://schemas.microsoft.com/office/drawing/2016/5/14/chartex" xmlns:mc="http://schemas.openxmlformats.org/markup-compatibility/2006" xmlns:m="http://schemas.openxmlformats.org/officeDocument/2006/math" xmlns:aink="http://schemas.microsoft.com/office/drawing/2016/ink" xmlns:am3d="http://schemas.microsoft.com/office/drawing/2017/model3d" xmlns:oel="http://schemas.microsoft.com/office/2019/extlst" xmlns:r="http://schemas.openxmlformats.org/officeDocument/2006/relationships" xmlns:wp14="http://schemas.microsoft.com/office/word/2010/wordprocessingDrawing" xmlns:wp="http://schemas.openxmlformats.org/drawingml/2006/wordprocessingDrawing" xmlns:wpg="http://schemas.microsoft.com/office/word/2010/wordprocessingGroup" xmlns:wpi="http://schemas.microsoft.com/office/word/2010/wordprocessingInk" xmlns:wps="http://schemas.microsoft.com/office/word/2010/wordprocessingShape" xmlns:o="urn:schemas-microsoft-com:office:office" xmlns:v="urn:schemas-microsoft-com:vml" xmlns:w10="urn:schemas-microsoft-com:office:word" xmlns:w="http://schemas.openxmlformats.org/wordprocessingml/2006/main" xmlns:w14="http://schemas.microsoft.com/office/word/2010/wordml" xmlns:w15="http://schemas.microsoft.com/office/word/2012/wordml" xmlns:w16cei="http://schemas.microsoft.com/office/word/2026/wordml/cei" xmlns:w16cex="http://schemas.microsoft.com/office/word/2018/wordml/cex" xmlns:w16cid="http://schemas.microsoft.com/office/word/2016/wordml/cid" xmlns:w16="http://schemas.microsoft.com/office/word/2018/wordml" xmlns:w16sdtdh="http://schemas.microsoft.com/office/word/2020/wordml/sdtdatahash" xmlns:w16sdtfl="http://schemas.microsoft.com/office/word/2024/wordml/sdtformatlock" xmlns:w16se="http://schemas.microsoft.com/office/word/2015/wordml/symex" xmlns:w16du="http://schemas.microsoft.com/office/word/2023/wordml/word16du" xmlns:wne="http://schemas.microsoft.com/office/word/2006/wordml" mc:Ignorable="w14 w15 w16se w16cid w16 w16cex w16sdtdh w16sdtfl w16du wp14">
   <w:endnote w:type="separator" w:id="-1">
     <w:p>
       <w:r>
@@ -11993,7 +12107,7 @@
 </file>
 
 <file path=word/footer1.xml><?xml version="1.0" encoding="utf-8"?>
-<w:ftr xmlns:wpc="http://schemas.microsoft.com/office/word/2010/wordprocessingCanvas" xmlns:cx="http://schemas.microsoft.com/office/drawing/2014/chartex" xmlns:cx1="http://schemas.microsoft.com/office/drawing/2015/9/8/chartex" xmlns:cx2="http://schemas.microsoft.com/office/drawing/2015/10/21/chartex" xmlns:cx3="http://schemas.microsoft.com/office/drawing/2016/5/9/chartex" xmlns:cx4="http://schemas.microsoft.com/office/drawing/2016/5/10/chartex" xmlns:cx5="http://schemas.microsoft.com/office/drawing/2016/5/11/chartex" xmlns:cx6="http://schemas.microsoft.com/office/drawing/2016/5/12/chartex" xmlns:cx7="http://schemas.microsoft.com/office/drawing/2016/5/13/chartex" xmlns:cx8="http://schemas.microsoft.com/office/drawing/2016/5/14/chartex" xmlns:mc="http://schemas.openxmlformats.org/markup-compatibility/2006" xmlns:m="http://schemas.openxmlformats.org/officeDocument/2006/math" xmlns:aink="http://schemas.microsoft.com/office/drawing/2016/ink" xmlns:am3d="http://schemas.microsoft.com/office/drawing/2017/model3d" xmlns:oel="http://schemas.microsoft.com/office/2019/extlst" xmlns:r="http://schemas.openxmlformats.org/officeDocument/2006/relationships" xmlns:wp14="http://schemas.microsoft.com/office/word/2010/wordprocessingDrawing" xmlns:wp="http://schemas.openxmlformats.org/drawingml/2006/wordprocessingDrawing" xmlns:wpg="http://schemas.microsoft.com/office/word/2010/wordprocessingGroup" xmlns:wpi="http://schemas.microsoft.com/office/word/2010/wordprocessingInk" xmlns:wps="http://schemas.microsoft.com/office/word/2010/wordprocessingShape" xmlns:o="urn:schemas-microsoft-com:office:office" xmlns:v="urn:schemas-microsoft-com:vml" xmlns:w10="urn:schemas-microsoft-com:office:word" xmlns:w="http://schemas.openxmlformats.org/wordprocessingml/2006/main" xmlns:w14="http://schemas.microsoft.com/office/word/2010/wordml" xmlns:w15="http://schemas.microsoft.com/office/word/2012/wordml" xmlns:w16cex="http://schemas.microsoft.com/office/word/2018/wordml/cex" xmlns:w16cid="http://schemas.microsoft.com/office/word/2016/wordml/cid" xmlns:w16="http://schemas.microsoft.com/office/word/2018/wordml" xmlns:w16sdtdh="http://schemas.microsoft.com/office/word/2020/wordml/sdtdatahash" xmlns:w16sdtfl="http://schemas.microsoft.com/office/word/2024/wordml/sdtformatlock" xmlns:w16se="http://schemas.microsoft.com/office/word/2015/wordml/symex" xmlns:w16du="http://schemas.microsoft.com/office/word/2023/wordml/word16du" xmlns:wne="http://schemas.microsoft.com/office/word/2006/wordml" mc:Ignorable="w14 w15 w16se w16cid w16 w16cex w16sdtdh w16sdtfl w16du wp14">
+<w:ftr xmlns:wpc="http://schemas.microsoft.com/office/word/2010/wordprocessingCanvas" xmlns:cx="http://schemas.microsoft.com/office/drawing/2014/chartex" xmlns:cx1="http://schemas.microsoft.com/office/drawing/2015/9/8/chartex" xmlns:cx2="http://schemas.microsoft.com/office/drawing/2015/10/21/chartex" xmlns:cx3="http://schemas.microsoft.com/office/drawing/2016/5/9/chartex" xmlns:cx4="http://schemas.microsoft.com/office/drawing/2016/5/10/chartex" xmlns:cx5="http://schemas.microsoft.com/office/drawing/2016/5/11/chartex" xmlns:cx6="http://schemas.microsoft.com/office/drawing/2016/5/12/chartex" xmlns:cx7="http://schemas.microsoft.com/office/drawing/2016/5/13/chartex" xmlns:cx8="http://schemas.microsoft.com/office/drawing/2016/5/14/chartex" xmlns:mc="http://schemas.openxmlformats.org/markup-compatibility/2006" xmlns:m="http://schemas.openxmlformats.org/officeDocument/2006/math" xmlns:aink="http://schemas.microsoft.com/office/drawing/2016/ink" xmlns:am3d="http://schemas.microsoft.com/office/drawing/2017/model3d" xmlns:oel="http://schemas.microsoft.com/office/2019/extlst" xmlns:r="http://schemas.openxmlformats.org/officeDocument/2006/relationships" xmlns:wp14="http://schemas.microsoft.com/office/word/2010/wordprocessingDrawing" xmlns:wp="http://schemas.openxmlformats.org/drawingml/2006/wordprocessingDrawing" xmlns:wpg="http://schemas.microsoft.com/office/word/2010/wordprocessingGroup" xmlns:wpi="http://schemas.microsoft.com/office/word/2010/wordprocessingInk" xmlns:wps="http://schemas.microsoft.com/office/word/2010/wordprocessingShape" xmlns:o="urn:schemas-microsoft-com:office:office" xmlns:v="urn:schemas-microsoft-com:vml" xmlns:w10="urn:schemas-microsoft-com:office:word" xmlns:w="http://schemas.openxmlformats.org/wordprocessingml/2006/main" xmlns:w14="http://schemas.microsoft.com/office/word/2010/wordml" xmlns:w15="http://schemas.microsoft.com/office/word/2012/wordml" xmlns:w16cei="http://schemas.microsoft.com/office/word/2026/wordml/cei" xmlns:w16cex="http://schemas.microsoft.com/office/word/2018/wordml/cex" xmlns:w16cid="http://schemas.microsoft.com/office/word/2016/wordml/cid" xmlns:w16="http://schemas.microsoft.com/office/word/2018/wordml" xmlns:w16sdtdh="http://schemas.microsoft.com/office/word/2020/wordml/sdtdatahash" xmlns:w16sdtfl="http://schemas.microsoft.com/office/word/2024/wordml/sdtformatlock" xmlns:w16se="http://schemas.microsoft.com/office/word/2015/wordml/symex" xmlns:w16du="http://schemas.microsoft.com/office/word/2023/wordml/word16du" xmlns:wne="http://schemas.microsoft.com/office/word/2006/wordml" mc:Ignorable="w14 w15 w16se w16cid w16 w16cex w16sdtdh w16sdtfl w16du wp14">
   <w:p>
     <w:pPr>
       <w:pBdr>
@@ -12076,7 +12190,7 @@
 </file>
 
 <file path=word/footnotes.xml><?xml version="1.0" encoding="utf-8"?>
-<w:footnotes xmlns:wpc="http://schemas.microsoft.com/office/word/2010/wordprocessingCanvas" xmlns:cx="http://schemas.microsoft.com/office/drawing/2014/chartex" xmlns:cx1="http://schemas.microsoft.com/office/drawing/2015/9/8/chartex" xmlns:cx2="http://schemas.microsoft.com/office/drawing/2015/10/21/chartex" xmlns:cx3="http://schemas.microsoft.com/office/drawing/2016/5/9/chartex" xmlns:cx4="http://schemas.microsoft.com/office/drawing/2016/5/10/chartex" xmlns:cx5="http://schemas.microsoft.com/office/drawing/2016/5/11/chartex" xmlns:cx6="http://schemas.microsoft.com/office/drawing/2016/5/12/chartex" xmlns:cx7="http://schemas.microsoft.com/office/drawing/2016/5/13/chartex" xmlns:cx8="http://schemas.microsoft.com/office/drawing/2016/5/14/chartex" xmlns:mc="http://schemas.openxmlformats.org/markup-compatibility/2006" xmlns:m="http://schemas.openxmlformats.org/officeDocument/2006/math" xmlns:aink="http://schemas.microsoft.com/office/drawing/2016/ink" xmlns:am3d="http://schemas.microsoft.com/office/drawing/2017/model3d" xmlns:oel="http://schemas.microsoft.com/office/2019/extlst" xmlns:r="http://schemas.openxmlformats.org/officeDocument/2006/relationships" xmlns:wp14="http://schemas.microsoft.com/office/word/2010/wordprocessingDrawing" xmlns:wp="http://schemas.openxmlformats.org/drawingml/2006/wordprocessingDrawing" xmlns:wpg="http://schemas.microsoft.com/office/word/2010/wordprocessingGroup" xmlns:wpi="http://schemas.microsoft.com/office/word/2010/wordprocessingInk" xmlns:wps="http://schemas.microsoft.com/office/word/2010/wordprocessingShape" xmlns:o="urn:schemas-microsoft-com:office:office" xmlns:v="urn:schemas-microsoft-com:vml" xmlns:w10="urn:schemas-microsoft-com:office:word" xmlns:w="http://schemas.openxmlformats.org/wordprocessingml/2006/main" xmlns:w14="http://schemas.microsoft.com/office/word/2010/wordml" xmlns:w15="http://schemas.microsoft.com/office/word/2012/wordml" xmlns:w16cex="http://schemas.microsoft.com/office/word/2018/wordml/cex" xmlns:w16cid="http://schemas.microsoft.com/office/word/2016/wordml/cid" xmlns:w16="http://schemas.microsoft.com/office/word/2018/wordml" xmlns:w16sdtdh="http://schemas.microsoft.com/office/word/2020/wordml/sdtdatahash" xmlns:w16sdtfl="http://schemas.microsoft.com/office/word/2024/wordml/sdtformatlock" xmlns:w16se="http://schemas.microsoft.com/office/word/2015/wordml/symex" xmlns:w16du="http://schemas.microsoft.com/office/word/2023/wordml/word16du" xmlns:wne="http://schemas.microsoft.com/office/word/2006/wordml" mc:Ignorable="w14 w15 w16se w16cid w16 w16cex w16sdtdh w16sdtfl w16du wp14">
+<w:footnotes xmlns:wpc="http://schemas.microsoft.com/office/word/2010/wordprocessingCanvas" xmlns:cx="http://schemas.microsoft.com/office/drawing/2014/chartex" xmlns:cx1="http://schemas.microsoft.com/office/drawing/2015/9/8/chartex" xmlns:cx2="http://schemas.microsoft.com/office/drawing/2015/10/21/chartex" xmlns:cx3="http://schemas.microsoft.com/office/drawing/2016/5/9/chartex" xmlns:cx4="http://schemas.microsoft.com/office/drawing/2016/5/10/chartex" xmlns:cx5="http://schemas.microsoft.com/office/drawing/2016/5/11/chartex" xmlns:cx6="http://schemas.microsoft.com/office/drawing/2016/5/12/chartex" xmlns:cx7="http://schemas.microsoft.com/office/drawing/2016/5/13/chartex" xmlns:cx8="http://schemas.microsoft.com/office/drawing/2016/5/14/chartex" xmlns:mc="http://schemas.openxmlformats.org/markup-compatibility/2006" xmlns:m="http://schemas.openxmlformats.org/officeDocument/2006/math" xmlns:aink="http://schemas.microsoft.com/office/drawing/2016/ink" xmlns:am3d="http://schemas.microsoft.com/office/drawing/2017/model3d" xmlns:oel="http://schemas.microsoft.com/office/2019/extlst" xmlns:r="http://schemas.openxmlformats.org/officeDocument/2006/relationships" xmlns:wp14="http://schemas.microsoft.com/office/word/2010/wordprocessingDrawing" xmlns:wp="http://schemas.openxmlformats.org/drawingml/2006/wordprocessingDrawing" xmlns:wpg="http://schemas.microsoft.com/office/word/2010/wordprocessingGroup" xmlns:wpi="http://schemas.microsoft.com/office/word/2010/wordprocessingInk" xmlns:wps="http://schemas.microsoft.com/office/word/2010/wordprocessingShape" xmlns:o="urn:schemas-microsoft-com:office:office" xmlns:v="urn:schemas-microsoft-com:vml" xmlns:w10="urn:schemas-microsoft-com:office:word" xmlns:w="http://schemas.openxmlformats.org/wordprocessingml/2006/main" xmlns:w14="http://schemas.microsoft.com/office/word/2010/wordml" xmlns:w15="http://schemas.microsoft.com/office/word/2012/wordml" xmlns:w16cei="http://schemas.microsoft.com/office/word/2026/wordml/cei" xmlns:w16cex="http://schemas.microsoft.com/office/word/2018/wordml/cex" xmlns:w16cid="http://schemas.microsoft.com/office/word/2016/wordml/cid" xmlns:w16="http://schemas.microsoft.com/office/word/2018/wordml" xmlns:w16sdtdh="http://schemas.microsoft.com/office/word/2020/wordml/sdtdatahash" xmlns:w16sdtfl="http://schemas.microsoft.com/office/word/2024/wordml/sdtformatlock" xmlns:w16se="http://schemas.microsoft.com/office/word/2015/wordml/symex" xmlns:w16du="http://schemas.microsoft.com/office/word/2023/wordml/word16du" xmlns:wne="http://schemas.microsoft.com/office/word/2006/wordml" mc:Ignorable="w14 w15 w16se w16cid w16 w16cex w16sdtdh w16sdtfl w16du wp14">
   <w:footnote w:type="separator" w:id="-1">
     <w:p>
       <w:r>
@@ -12095,7 +12209,7 @@
 </file>
 
 <file path=word/header1.xml><?xml version="1.0" encoding="utf-8"?>
-<w:hdr xmlns:wpc="http://schemas.microsoft.com/office/word/2010/wordprocessingCanvas" xmlns:cx="http://schemas.microsoft.com/office/drawing/2014/chartex" xmlns:cx1="http://schemas.microsoft.com/office/drawing/2015/9/8/chartex" xmlns:cx2="http://schemas.microsoft.com/office/drawing/2015/10/21/chartex" xmlns:cx3="http://schemas.microsoft.com/office/drawing/2016/5/9/chartex" xmlns:cx4="http://schemas.microsoft.com/office/drawing/2016/5/10/chartex" xmlns:cx5="http://schemas.microsoft.com/office/drawing/2016/5/11/chartex" xmlns:cx6="http://schemas.microsoft.com/office/drawing/2016/5/12/chartex" xmlns:cx7="http://schemas.microsoft.com/office/drawing/2016/5/13/chartex" xmlns:cx8="http://schemas.microsoft.com/office/drawing/2016/5/14/chartex" xmlns:mc="http://schemas.openxmlformats.org/markup-compatibility/2006" xmlns:m="http://schemas.openxmlformats.org/officeDocument/2006/math" xmlns:aink="http://schemas.microsoft.com/office/drawing/2016/ink" xmlns:am3d="http://schemas.microsoft.com/office/drawing/2017/model3d" xmlns:oel="http://schemas.microsoft.com/office/2019/extlst" xmlns:r="http://schemas.openxmlformats.org/officeDocument/2006/relationships" xmlns:wp14="http://schemas.microsoft.com/office/word/2010/wordprocessingDrawing" xmlns:wp="http://schemas.openxmlformats.org/drawingml/2006/wordprocessingDrawing" xmlns:wpg="http://schemas.microsoft.com/office/word/2010/wordprocessingGroup" xmlns:wpi="http://schemas.microsoft.com/office/word/2010/wordprocessingInk" xmlns:wps="http://schemas.microsoft.com/office/word/2010/wordprocessingShape" xmlns:o="urn:schemas-microsoft-com:office:office" xmlns:v="urn:schemas-microsoft-com:vml" xmlns:w10="urn:schemas-microsoft-com:office:word" xmlns:w="http://schemas.openxmlformats.org/wordprocessingml/2006/main" xmlns:w14="http://schemas.microsoft.com/office/word/2010/wordml" xmlns:w15="http://schemas.microsoft.com/office/word/2012/wordml" xmlns:w16cex="http://schemas.microsoft.com/office/word/2018/wordml/cex" xmlns:w16cid="http://schemas.microsoft.com/office/word/2016/wordml/cid" xmlns:w16="http://schemas.microsoft.com/office/word/2018/wordml" xmlns:w16sdtdh="http://schemas.microsoft.com/office/word/2020/wordml/sdtdatahash" xmlns:w16sdtfl="http://schemas.microsoft.com/office/word/2024/wordml/sdtformatlock" xmlns:w16se="http://schemas.microsoft.com/office/word/2015/wordml/symex" xmlns:w16du="http://schemas.microsoft.com/office/word/2023/wordml/word16du" xmlns:wne="http://schemas.microsoft.com/office/word/2006/wordml" mc:Ignorable="w14 w15 w16se w16cid w16 w16cex w16sdtdh w16sdtfl w16du wp14">
+<w:hdr xmlns:wpc="http://schemas.microsoft.com/office/word/2010/wordprocessingCanvas" xmlns:cx="http://schemas.microsoft.com/office/drawing/2014/chartex" xmlns:cx1="http://schemas.microsoft.com/office/drawing/2015/9/8/chartex" xmlns:cx2="http://schemas.microsoft.com/office/drawing/2015/10/21/chartex" xmlns:cx3="http://schemas.microsoft.com/office/drawing/2016/5/9/chartex" xmlns:cx4="http://schemas.microsoft.com/office/drawing/2016/5/10/chartex" xmlns:cx5="http://schemas.microsoft.com/office/drawing/2016/5/11/chartex" xmlns:cx6="http://schemas.microsoft.com/office/drawing/2016/5/12/chartex" xmlns:cx7="http://schemas.microsoft.com/office/drawing/2016/5/13/chartex" xmlns:cx8="http://schemas.microsoft.com/office/drawing/2016/5/14/chartex" xmlns:mc="http://schemas.openxmlformats.org/markup-compatibility/2006" xmlns:m="http://schemas.openxmlformats.org/officeDocument/2006/math" xmlns:aink="http://schemas.microsoft.com/office/drawing/2016/ink" xmlns:am3d="http://schemas.microsoft.com/office/drawing/2017/model3d" xmlns:oel="http://schemas.microsoft.com/office/2019/extlst" xmlns:r="http://schemas.openxmlformats.org/officeDocument/2006/relationships" xmlns:wp14="http://schemas.microsoft.com/office/word/2010/wordprocessingDrawing" xmlns:wp="http://schemas.openxmlformats.org/drawingml/2006/wordprocessingDrawing" xmlns:wpg="http://schemas.microsoft.com/office/word/2010/wordprocessingGroup" xmlns:wpi="http://schemas.microsoft.com/office/word/2010/wordprocessingInk" xmlns:wps="http://schemas.microsoft.com/office/word/2010/wordprocessingShape" xmlns:o="urn:schemas-microsoft-com:office:office" xmlns:v="urn:schemas-microsoft-com:vml" xmlns:w10="urn:schemas-microsoft-com:office:word" xmlns:w="http://schemas.openxmlformats.org/wordprocessingml/2006/main" xmlns:w14="http://schemas.microsoft.com/office/word/2010/wordml" xmlns:w15="http://schemas.microsoft.com/office/word/2012/wordml" xmlns:w16cei="http://schemas.microsoft.com/office/word/2026/wordml/cei" xmlns:w16cex="http://schemas.microsoft.com/office/word/2018/wordml/cex" xmlns:w16cid="http://schemas.microsoft.com/office/word/2016/wordml/cid" xmlns:w16="http://schemas.microsoft.com/office/word/2018/wordml" xmlns:w16sdtdh="http://schemas.microsoft.com/office/word/2020/wordml/sdtdatahash" xmlns:w16sdtfl="http://schemas.microsoft.com/office/word/2024/wordml/sdtformatlock" xmlns:w16se="http://schemas.microsoft.com/office/word/2015/wordml/symex" xmlns:w16du="http://schemas.microsoft.com/office/word/2023/wordml/word16du" xmlns:wne="http://schemas.microsoft.com/office/word/2006/wordml" mc:Ignorable="w14 w15 w16se w16cid w16 w16cex w16sdtdh w16sdtfl w16du wp14">
   <w:p>
     <w:pPr>
       <w:pBdr>
@@ -12146,7 +12260,7 @@
 </file>
 
 <file path=word/numbering.xml><?xml version="1.0" encoding="utf-8"?>
-<w:numbering xmlns:wpc="http://schemas.microsoft.com/office/word/2010/wordprocessingCanvas" xmlns:cx="http://schemas.microsoft.com/office/drawing/2014/chartex" xmlns:cx1="http://schemas.microsoft.com/office/drawing/2015/9/8/chartex" xmlns:cx2="http://schemas.microsoft.com/office/drawing/2015/10/21/chartex" xmlns:cx3="http://schemas.microsoft.com/office/drawing/2016/5/9/chartex" xmlns:cx4="http://schemas.microsoft.com/office/drawing/2016/5/10/chartex" xmlns:cx5="http://schemas.microsoft.com/office/drawing/2016/5/11/chartex" xmlns:cx6="http://schemas.microsoft.com/office/drawing/2016/5/12/chartex" xmlns:cx7="http://schemas.microsoft.com/office/drawing/2016/5/13/chartex" xmlns:cx8="http://schemas.microsoft.com/office/drawing/2016/5/14/chartex" xmlns:mc="http://schemas.openxmlformats.org/markup-compatibility/2006" xmlns:m="http://schemas.openxmlformats.org/officeDocument/2006/math" xmlns:aink="http://schemas.microsoft.com/office/drawing/2016/ink" xmlns:am3d="http://schemas.microsoft.com/office/drawing/2017/model3d" xmlns:oel="http://schemas.microsoft.com/office/2019/extlst" xmlns:r="http://schemas.openxmlformats.org/officeDocument/2006/relationships" xmlns:wp14="http://schemas.microsoft.com/office/word/2010/wordprocessingDrawing" xmlns:wp="http://schemas.openxmlformats.org/drawingml/2006/wordprocessingDrawing" xmlns:wpg="http://schemas.microsoft.com/office/word/2010/wordprocessingGroup" xmlns:wpi="http://schemas.microsoft.com/office/word/2010/wordprocessingInk" xmlns:wps="http://schemas.microsoft.com/office/word/2010/wordprocessingShape" xmlns:o="urn:schemas-microsoft-com:office:office" xmlns:v="urn:schemas-microsoft-com:vml" xmlns:w10="urn:schemas-microsoft-com:office:word" xmlns:w="http://schemas.openxmlformats.org/wordprocessingml/2006/main" xmlns:w14="http://schemas.microsoft.com/office/word/2010/wordml" xmlns:w15="http://schemas.microsoft.com/office/word/2012/wordml" xmlns:w16cex="http://schemas.microsoft.com/office/word/2018/wordml/cex" xmlns:w16cid="http://schemas.microsoft.com/office/word/2016/wordml/cid" xmlns:w16="http://schemas.microsoft.com/office/word/2018/wordml" xmlns:w16sdtdh="http://schemas.microsoft.com/office/word/2020/wordml/sdtdatahash" xmlns:w16sdtfl="http://schemas.microsoft.com/office/word/2024/wordml/sdtformatlock" xmlns:w16se="http://schemas.microsoft.com/office/word/2015/wordml/symex" xmlns:w16du="http://schemas.microsoft.com/office/word/2023/wordml/word16du" xmlns:wne="http://schemas.microsoft.com/office/word/2006/wordml" mc:Ignorable="w14 w15 w16se w16cid w16 w16cex w16sdtdh w16sdtfl w16du wp14">
+<w:numbering xmlns:wpc="http://schemas.microsoft.com/office/word/2010/wordprocessingCanvas" xmlns:cx="http://schemas.microsoft.com/office/drawing/2014/chartex" xmlns:cx1="http://schemas.microsoft.com/office/drawing/2015/9/8/chartex" xmlns:cx2="http://schemas.microsoft.com/office/drawing/2015/10/21/chartex" xmlns:cx3="http://schemas.microsoft.com/office/drawing/2016/5/9/chartex" xmlns:cx4="http://schemas.microsoft.com/office/drawing/2016/5/10/chartex" xmlns:cx5="http://schemas.microsoft.com/office/drawing/2016/5/11/chartex" xmlns:cx6="http://schemas.microsoft.com/office/drawing/2016/5/12/chartex" xmlns:cx7="http://schemas.microsoft.com/office/drawing/2016/5/13/chartex" xmlns:cx8="http://schemas.microsoft.com/office/drawing/2016/5/14/chartex" xmlns:mc="http://schemas.openxmlformats.org/markup-compatibility/2006" xmlns:m="http://schemas.openxmlformats.org/officeDocument/2006/math" xmlns:aink="http://schemas.microsoft.com/office/drawing/2016/ink" xmlns:am3d="http://schemas.microsoft.com/office/drawing/2017/model3d" xmlns:oel="http://schemas.microsoft.com/office/2019/extlst" xmlns:r="http://schemas.openxmlformats.org/officeDocument/2006/relationships" xmlns:wp14="http://schemas.microsoft.com/office/word/2010/wordprocessingDrawing" xmlns:wp="http://schemas.openxmlformats.org/drawingml/2006/wordprocessingDrawing" xmlns:wpg="http://schemas.microsoft.com/office/word/2010/wordprocessingGroup" xmlns:wpi="http://schemas.microsoft.com/office/word/2010/wordprocessingInk" xmlns:wps="http://schemas.microsoft.com/office/word/2010/wordprocessingShape" xmlns:o="urn:schemas-microsoft-com:office:office" xmlns:v="urn:schemas-microsoft-com:vml" xmlns:w10="urn:schemas-microsoft-com:office:word" xmlns:w="http://schemas.openxmlformats.org/wordprocessingml/2006/main" xmlns:w14="http://schemas.microsoft.com/office/word/2010/wordml" xmlns:w15="http://schemas.microsoft.com/office/word/2012/wordml" xmlns:w16cei="http://schemas.microsoft.com/office/word/2026/wordml/cei" xmlns:w16cex="http://schemas.microsoft.com/office/word/2018/wordml/cex" xmlns:w16cid="http://schemas.microsoft.com/office/word/2016/wordml/cid" xmlns:w16="http://schemas.microsoft.com/office/word/2018/wordml" xmlns:w16sdtdh="http://schemas.microsoft.com/office/word/2020/wordml/sdtdatahash" xmlns:w16sdtfl="http://schemas.microsoft.com/office/word/2024/wordml/sdtformatlock" xmlns:w16se="http://schemas.microsoft.com/office/word/2015/wordml/symex" xmlns:w16du="http://schemas.microsoft.com/office/word/2023/wordml/word16du" xmlns:wne="http://schemas.microsoft.com/office/word/2006/wordml" mc:Ignorable="w14 w15 w16se w16cid w16 w16cex w16sdtdh w16sdtfl w16du wp14">
   <w:abstractNum w:abstractNumId="0" w15:restartNumberingAfterBreak="0">
     <w:nsid w:val="FFFFFF7C"/>
     <w:multiLevelType w:val="singleLevel"/>

</xml_diff>

<commit_message>
docs: update course decks and notes, add handout; ignore working/
Co-Authored-By: Claude Sonnet 5 <noreply@anthropic.com>
</commit_message>
<xml_diff>
--- a/docs/TCA-notes.docx
+++ b/docs/TCA-notes.docx
@@ -2076,6 +2076,12 @@
                 <w:sz w:val="18"/>
               </w:rPr>
             </w:pPr>
+            <w:r>
+              <w:rPr>
+                <w:sz w:val="18"/>
+              </w:rPr>
+              <w:t>Paul</w:t>
+            </w:r>
           </w:p>
         </w:tc>
       </w:tr>
@@ -2182,6 +2188,12 @@
                 <w:sz w:val="18"/>
               </w:rPr>
             </w:pPr>
+            <w:r>
+              <w:rPr>
+                <w:sz w:val="18"/>
+              </w:rPr>
+              <w:t>Joris</w:t>
+            </w:r>
           </w:p>
         </w:tc>
       </w:tr>
@@ -2288,6 +2300,12 @@
                 <w:sz w:val="18"/>
               </w:rPr>
             </w:pPr>
+            <w:r>
+              <w:rPr>
+                <w:sz w:val="18"/>
+              </w:rPr>
+              <w:t>Paul</w:t>
+            </w:r>
           </w:p>
         </w:tc>
       </w:tr>
@@ -3461,70 +3479,56 @@
         <w:tc>
           <w:tcPr>
             <w:tcW w:w="2880" w:type="dxa"/>
-            <w:shd w:val="clear" w:color="auto" w:fill="F5F0FF"/>
-          </w:tcPr>
-          <w:p>
-            <w:r>
-              <w:rPr>
-                <w:sz w:val="18"/>
-              </w:rPr>
-              <w:t>/</w:t>
-            </w:r>
-            <w:proofErr w:type="gramStart"/>
-            <w:r>
-              <w:rPr>
-                <w:sz w:val="18"/>
-              </w:rPr>
-              <w:t>context  (</w:t>
-            </w:r>
-            <w:proofErr w:type="gramEnd"/>
-            <w:r>
-              <w:rPr>
-                <w:sz w:val="18"/>
-              </w:rPr>
-              <w:t>Codex: /status)</w:t>
-            </w:r>
-          </w:p>
-        </w:tc>
-        <w:tc>
-          <w:tcPr>
-            <w:tcW w:w="2880" w:type="dxa"/>
-            <w:shd w:val="clear" w:color="auto" w:fill="F5F0FF"/>
-          </w:tcPr>
-          <w:p>
-            <w:r>
-              <w:rPr>
-                <w:sz w:val="18"/>
-              </w:rPr>
-              <w:t>Read the token map: system prompt, tools, MCP, memory files, history, free space.</w:t>
-            </w:r>
-          </w:p>
-        </w:tc>
-        <w:tc>
-          <w:tcPr>
-            <w:tcW w:w="2880" w:type="dxa"/>
-            <w:shd w:val="clear" w:color="auto" w:fill="F5F0FF"/>
-          </w:tcPr>
-          <w:p>
-            <w:r>
-              <w:rPr>
-                <w:sz w:val="18"/>
-              </w:rPr>
-              <w:t>Treat it like top/</w:t>
+            <w:shd w:val="clear" w:color="auto" w:fill="FFFFFF"/>
+          </w:tcPr>
+          <w:p>
+            <w:r>
+              <w:rPr>
+                <w:sz w:val="18"/>
+              </w:rPr>
+              <w:t>Plan Mode</w:t>
+            </w:r>
+          </w:p>
+        </w:tc>
+        <w:tc>
+          <w:tcPr>
+            <w:tcW w:w="2880" w:type="dxa"/>
+            <w:shd w:val="clear" w:color="auto" w:fill="FFFFFF"/>
+          </w:tcPr>
+          <w:p>
+            <w:r>
+              <w:rPr>
+                <w:sz w:val="18"/>
+              </w:rPr>
+              <w:t xml:space="preserve">Claude: </w:t>
             </w:r>
             <w:proofErr w:type="spellStart"/>
             <w:r>
               <w:rPr>
                 <w:sz w:val="18"/>
               </w:rPr>
-              <w:t>htop</w:t>
+              <w:t>Shift+Tab</w:t>
             </w:r>
             <w:proofErr w:type="spellEnd"/>
             <w:r>
               <w:rPr>
                 <w:sz w:val="18"/>
               </w:rPr>
-              <w:t>. Check it before a big task; prune if a connector eats 40% before you type.</w:t>
+              <w:t xml:space="preserve"> (plan, no files touched). Codex: /plan or run read-only.</w:t>
+            </w:r>
+          </w:p>
+        </w:tc>
+        <w:tc>
+          <w:tcPr>
+            <w:tcW w:w="2880" w:type="dxa"/>
+            <w:shd w:val="clear" w:color="auto" w:fill="FFFFFF"/>
+          </w:tcPr>
+          <w:p>
+            <w:r>
+              <w:rPr>
+                <w:sz w:val="18"/>
+              </w:rPr>
+              <w:t>Review it like a junior's design doc and correct it where changes are free. Use it for anything you cannot easily undo.</w:t>
             </w:r>
           </w:p>
         </w:tc>
@@ -3533,56 +3537,56 @@
         <w:tc>
           <w:tcPr>
             <w:tcW w:w="2880" w:type="dxa"/>
-            <w:shd w:val="clear" w:color="auto" w:fill="FFFFFF"/>
-          </w:tcPr>
-          <w:p>
-            <w:r>
-              <w:rPr>
-                <w:sz w:val="18"/>
-              </w:rPr>
-              <w:t>@-file</w:t>
-            </w:r>
-          </w:p>
-        </w:tc>
-        <w:tc>
-          <w:tcPr>
-            <w:tcW w:w="2880" w:type="dxa"/>
-            <w:shd w:val="clear" w:color="auto" w:fill="FFFFFF"/>
-          </w:tcPr>
-          <w:p>
-            <w:r>
-              <w:rPr>
-                <w:sz w:val="18"/>
-              </w:rPr>
-              <w:t>Type @path/to/file to pin exact files into context.</w:t>
-            </w:r>
-          </w:p>
-        </w:tc>
-        <w:tc>
-          <w:tcPr>
-            <w:tcW w:w="2880" w:type="dxa"/>
-            <w:shd w:val="clear" w:color="auto" w:fill="FFFFFF"/>
-          </w:tcPr>
-          <w:p>
-            <w:r>
-              <w:rPr>
-                <w:sz w:val="18"/>
-              </w:rPr>
-              <w:t xml:space="preserve">Precision beats </w:t>
-            </w:r>
-            <w:proofErr w:type="gramStart"/>
-            <w:r>
-              <w:rPr>
-                <w:sz w:val="18"/>
-              </w:rPr>
-              <w:t>pasting:</w:t>
-            </w:r>
-            <w:proofErr w:type="gramEnd"/>
-            <w:r>
-              <w:rPr>
-                <w:sz w:val="18"/>
-              </w:rPr>
-              <w:t xml:space="preserve"> lower token cost, sharper answers.</w:t>
+            <w:shd w:val="clear" w:color="auto" w:fill="F5F0FF"/>
+          </w:tcPr>
+          <w:p>
+            <w:r>
+              <w:rPr>
+                <w:sz w:val="18"/>
+              </w:rPr>
+              <w:t>Approvals / sandbox</w:t>
+            </w:r>
+          </w:p>
+        </w:tc>
+        <w:tc>
+          <w:tcPr>
+            <w:tcW w:w="2880" w:type="dxa"/>
+            <w:shd w:val="clear" w:color="auto" w:fill="F5F0FF"/>
+          </w:tcPr>
+          <w:p>
+            <w:r>
+              <w:rPr>
+                <w:sz w:val="18"/>
+              </w:rPr>
+              <w:t>Claude: toggle approve-each vs auto-accept (</w:t>
+            </w:r>
+            <w:proofErr w:type="spellStart"/>
+            <w:r>
+              <w:rPr>
+                <w:sz w:val="18"/>
+              </w:rPr>
+              <w:t>Shift+Tab</w:t>
+            </w:r>
+            <w:proofErr w:type="spellEnd"/>
+            <w:r>
+              <w:rPr>
+                <w:sz w:val="18"/>
+              </w:rPr>
+              <w:t>). Codex: /approvals — read-only, workspace-write, full-access.</w:t>
+            </w:r>
+          </w:p>
+        </w:tc>
+        <w:tc>
+          <w:tcPr>
+            <w:tcW w:w="2880" w:type="dxa"/>
+            <w:shd w:val="clear" w:color="auto" w:fill="F5F0FF"/>
+          </w:tcPr>
+          <w:p>
+            <w:r>
+              <w:rPr>
+                <w:sz w:val="18"/>
+              </w:rPr>
+              <w:t>Auto-accept only with a sandbox and tight constraints. Never auto-run destructive shell in a real repo.</w:t>
             </w:r>
           </w:p>
         </w:tc>
@@ -3605,9 +3609,15 @@
               <w:rPr>
                 <w:sz w:val="18"/>
               </w:rPr>
-              <w:t>model</w:t>
+              <w:t>clear</w:t>
             </w:r>
             <w:proofErr w:type="gramEnd"/>
+            <w:r>
+              <w:rPr>
+                <w:sz w:val="18"/>
+              </w:rPr>
+              <w:t xml:space="preserve"> and /compact</w:t>
+            </w:r>
           </w:p>
         </w:tc>
         <w:tc>
@@ -3620,7 +3630,7 @@
               <w:rPr>
                 <w:sz w:val="18"/>
               </w:rPr>
-              <w:t>Switch model / reasoning effort mid-session.</w:t>
+              <w:t>Claude: /clear fresh, /compact to summarise. Codex: /new fresh, /compact to summarise.</w:t>
             </w:r>
           </w:p>
         </w:tc>
@@ -3634,7 +3644,7 @@
               <w:rPr>
                 <w:sz w:val="18"/>
               </w:rPr>
-              <w:t>A quality-and-cost lever you hold. Codex's /model also sets reasoning effort.</w:t>
+              <w:t>Ending a confused session is a senior habit, not a failure.</w:t>
             </w:r>
           </w:p>
         </w:tc>
@@ -3650,7 +3660,7 @@
               <w:rPr>
                 <w:sz w:val="18"/>
               </w:rPr>
-              <w:t>Plan Mode</w:t>
+              <w:t>Spot-check output</w:t>
             </w:r>
           </w:p>
         </w:tc>
@@ -3664,21 +3674,7 @@
               <w:rPr>
                 <w:sz w:val="18"/>
               </w:rPr>
-              <w:t xml:space="preserve">Claude: </w:t>
-            </w:r>
-            <w:proofErr w:type="spellStart"/>
-            <w:r>
-              <w:rPr>
-                <w:sz w:val="18"/>
-              </w:rPr>
-              <w:t>Shift+Tab</w:t>
-            </w:r>
-            <w:proofErr w:type="spellEnd"/>
-            <w:r>
-              <w:rPr>
-                <w:sz w:val="18"/>
-              </w:rPr>
-              <w:t xml:space="preserve"> (plan, no files touched). Codex: /plan or run read-only.</w:t>
+              <w:t>Glance at the diff and the running app.</w:t>
             </w:r>
           </w:p>
         </w:tc>
@@ -3692,7 +3688,93 @@
               <w:rPr>
                 <w:sz w:val="18"/>
               </w:rPr>
-              <w:t>Review it like a junior's design doc and correct it where changes are free. Use it for anything you cannot easily undo.</w:t>
+              <w:t xml:space="preserve">Learn the failure shapes: confident-but-wrong logic, silently </w:t>
+            </w:r>
+            <w:r>
+              <w:rPr>
+                <w:sz w:val="18"/>
+              </w:rPr>
+              <w:lastRenderedPageBreak/>
+              <w:t>skipped edge cases. You are the tester, not the line reviewer.</w:t>
+            </w:r>
+          </w:p>
+        </w:tc>
+      </w:tr>
+    </w:tbl>
+    <w:p>
+      <w:pPr>
+        <w:spacing w:after="120"/>
+      </w:pPr>
+    </w:p>
+    <w:tbl>
+      <w:tblPr>
+        <w:tblStyle w:val="TableNormal0"/>
+        <w:tblW w:w="0" w:type="auto"/>
+        <w:tblInd w:w="0" w:type="dxa"/>
+        <w:tblBorders>
+          <w:top w:val="single" w:sz="4" w:space="0" w:color="D9CCEF"/>
+          <w:left w:val="single" w:sz="4" w:space="0" w:color="D9CCEF"/>
+          <w:bottom w:val="single" w:sz="4" w:space="0" w:color="D9CCEF"/>
+          <w:right w:val="single" w:sz="4" w:space="0" w:color="D9CCEF"/>
+          <w:insideH w:val="single" w:sz="4" w:space="0" w:color="D9CCEF"/>
+          <w:insideV w:val="single" w:sz="4" w:space="0" w:color="D9CCEF"/>
+        </w:tblBorders>
+        <w:tblLook w:val="04A0" w:firstRow="1" w:lastRow="0" w:firstColumn="1" w:lastColumn="0" w:noHBand="0" w:noVBand="1"/>
+      </w:tblPr>
+      <w:tblGrid>
+        <w:gridCol w:w="2880"/>
+        <w:gridCol w:w="2880"/>
+        <w:gridCol w:w="2880"/>
+      </w:tblGrid>
+      <w:tr>
+        <w:tc>
+          <w:tcPr>
+            <w:tcW w:w="2880" w:type="dxa"/>
+            <w:shd w:val="clear" w:color="auto" w:fill="5E02D1"/>
+          </w:tcPr>
+          <w:p>
+            <w:r>
+              <w:rPr>
+                <w:b/>
+                <w:bCs/>
+                <w:color w:val="FFFFFF"/>
+                <w:sz w:val="18"/>
+              </w:rPr>
+              <w:t>Want to...</w:t>
+            </w:r>
+          </w:p>
+        </w:tc>
+        <w:tc>
+          <w:tcPr>
+            <w:tcW w:w="2880" w:type="dxa"/>
+            <w:shd w:val="clear" w:color="auto" w:fill="5E02D1"/>
+          </w:tcPr>
+          <w:p>
+            <w:r>
+              <w:rPr>
+                <w:b/>
+                <w:bCs/>
+                <w:color w:val="FFFFFF"/>
+                <w:sz w:val="18"/>
+              </w:rPr>
+              <w:t>Claude Code</w:t>
+            </w:r>
+          </w:p>
+        </w:tc>
+        <w:tc>
+          <w:tcPr>
+            <w:tcW w:w="2880" w:type="dxa"/>
+            <w:shd w:val="clear" w:color="auto" w:fill="5E02D1"/>
+          </w:tcPr>
+          <w:p>
+            <w:r>
+              <w:rPr>
+                <w:b/>
+                <w:bCs/>
+                <w:color w:val="FFFFFF"/>
+                <w:sz w:val="18"/>
+              </w:rPr>
+              <w:t>Codex</w:t>
             </w:r>
           </w:p>
         </w:tc>
@@ -3708,8 +3790,7 @@
               <w:rPr>
                 <w:sz w:val="18"/>
               </w:rPr>
-              <w:lastRenderedPageBreak/>
-              <w:t>Approvals / sandbox</w:t>
+              <w:t>Clean slate</w:t>
             </w:r>
           </w:p>
         </w:tc>
@@ -3723,22 +3804,16 @@
               <w:rPr>
                 <w:sz w:val="18"/>
               </w:rPr>
-              <w:t>Claude: toggle approve-each vs auto-accept (</w:t>
-            </w:r>
-            <w:proofErr w:type="spellStart"/>
-            <w:r>
-              <w:rPr>
-                <w:sz w:val="18"/>
-              </w:rPr>
-              <w:t>Shift+Tab</w:t>
-            </w:r>
-            <w:proofErr w:type="spellEnd"/>
-            <w:r>
-              <w:rPr>
-                <w:sz w:val="18"/>
-              </w:rPr>
-              <w:t>). Codex: /approvals — read-only, workspace-write, full-access.</w:t>
-            </w:r>
+              <w:t>/</w:t>
+            </w:r>
+            <w:proofErr w:type="gramStart"/>
+            <w:r>
+              <w:rPr>
+                <w:sz w:val="18"/>
+              </w:rPr>
+              <w:t>clear</w:t>
+            </w:r>
+            <w:proofErr w:type="gramEnd"/>
           </w:p>
         </w:tc>
         <w:tc>
@@ -3751,8 +3826,16 @@
               <w:rPr>
                 <w:sz w:val="18"/>
               </w:rPr>
-              <w:t>Auto-accept only with a sandbox and tight constraints. Never auto-run destructive shell in a real repo.</w:t>
-            </w:r>
+              <w:t>/</w:t>
+            </w:r>
+            <w:proofErr w:type="gramStart"/>
+            <w:r>
+              <w:rPr>
+                <w:sz w:val="18"/>
+              </w:rPr>
+              <w:t>new</w:t>
+            </w:r>
+            <w:proofErr w:type="gramEnd"/>
           </w:p>
         </w:tc>
       </w:tr>
@@ -3767,7 +3850,7 @@
               <w:rPr>
                 <w:sz w:val="18"/>
               </w:rPr>
-              <w:t>Undo</w:t>
+              <w:t>Summarise a long session</w:t>
             </w:r>
           </w:p>
         </w:tc>
@@ -3781,8 +3864,16 @@
               <w:rPr>
                 <w:sz w:val="18"/>
               </w:rPr>
-              <w:t>Claude: /rewind (or Esc twice) restores code/conversation. Codex: no in-session rewind — rely on git + session resume.</w:t>
-            </w:r>
+              <w:t>/</w:t>
+            </w:r>
+            <w:proofErr w:type="gramStart"/>
+            <w:r>
+              <w:rPr>
+                <w:sz w:val="18"/>
+              </w:rPr>
+              <w:t>compact</w:t>
+            </w:r>
+            <w:proofErr w:type="gramEnd"/>
           </w:p>
         </w:tc>
         <w:tc>
@@ -3795,8 +3886,16 @@
               <w:rPr>
                 <w:sz w:val="18"/>
               </w:rPr>
-              <w:t>Explore boldly when rollback is one keystroke (or one git command) away.</w:t>
-            </w:r>
+              <w:t>/</w:t>
+            </w:r>
+            <w:proofErr w:type="gramStart"/>
+            <w:r>
+              <w:rPr>
+                <w:sz w:val="18"/>
+              </w:rPr>
+              <w:t>compact</w:t>
+            </w:r>
+            <w:proofErr w:type="gramEnd"/>
           </w:p>
         </w:tc>
       </w:tr>
@@ -3811,6 +3910,20 @@
               <w:rPr>
                 <w:sz w:val="18"/>
               </w:rPr>
+              <w:t>See what fills the context</w:t>
+            </w:r>
+          </w:p>
+        </w:tc>
+        <w:tc>
+          <w:tcPr>
+            <w:tcW w:w="2880" w:type="dxa"/>
+            <w:shd w:val="clear" w:color="auto" w:fill="F5F0FF"/>
+          </w:tcPr>
+          <w:p>
+            <w:r>
+              <w:rPr>
+                <w:sz w:val="18"/>
+              </w:rPr>
               <w:t>/</w:t>
             </w:r>
             <w:proofErr w:type="gramStart"/>
@@ -3818,15 +3931,9 @@
               <w:rPr>
                 <w:sz w:val="18"/>
               </w:rPr>
-              <w:t>clear</w:t>
+              <w:t>context</w:t>
             </w:r>
             <w:proofErr w:type="gramEnd"/>
-            <w:r>
-              <w:rPr>
-                <w:sz w:val="18"/>
-              </w:rPr>
-              <w:t xml:space="preserve"> and /compact</w:t>
-            </w:r>
           </w:p>
         </w:tc>
         <w:tc>
@@ -3839,22 +3946,16 @@
               <w:rPr>
                 <w:sz w:val="18"/>
               </w:rPr>
-              <w:t>Claude: /clear fresh, /compact to summarise. Codex: /new fresh, /compact to summarise.</w:t>
-            </w:r>
-          </w:p>
-        </w:tc>
-        <w:tc>
-          <w:tcPr>
-            <w:tcW w:w="2880" w:type="dxa"/>
-            <w:shd w:val="clear" w:color="auto" w:fill="F5F0FF"/>
-          </w:tcPr>
-          <w:p>
-            <w:r>
-              <w:rPr>
-                <w:sz w:val="18"/>
-              </w:rPr>
-              <w:t>Ending a confused session is a senior habit, not a failure.</w:t>
-            </w:r>
+              <w:t>/</w:t>
+            </w:r>
+            <w:proofErr w:type="gramStart"/>
+            <w:r>
+              <w:rPr>
+                <w:sz w:val="18"/>
+              </w:rPr>
+              <w:t>status</w:t>
+            </w:r>
+            <w:proofErr w:type="gramEnd"/>
           </w:p>
         </w:tc>
       </w:tr>
@@ -3869,7 +3970,7 @@
               <w:rPr>
                 <w:sz w:val="18"/>
               </w:rPr>
-              <w:t>Spot-check output</w:t>
+              <w:t>Token usage / cost</w:t>
             </w:r>
           </w:p>
         </w:tc>
@@ -3883,8 +3984,16 @@
               <w:rPr>
                 <w:sz w:val="18"/>
               </w:rPr>
-              <w:t>Glance at the diff and the running app.</w:t>
-            </w:r>
+              <w:t>/</w:t>
+            </w:r>
+            <w:proofErr w:type="gramStart"/>
+            <w:r>
+              <w:rPr>
+                <w:sz w:val="18"/>
+              </w:rPr>
+              <w:t>usage</w:t>
+            </w:r>
+            <w:proofErr w:type="gramEnd"/>
           </w:p>
         </w:tc>
         <w:tc>
@@ -3897,8 +4006,914 @@
               <w:rPr>
                 <w:sz w:val="18"/>
               </w:rPr>
-              <w:t>Learn the failure shapes: confident-but-wrong logic, silently skipped edge cases. You are the tester, not the line reviewer.</w:t>
-            </w:r>
+              <w:t>/</w:t>
+            </w:r>
+            <w:proofErr w:type="gramStart"/>
+            <w:r>
+              <w:rPr>
+                <w:sz w:val="18"/>
+              </w:rPr>
+              <w:t>status</w:t>
+            </w:r>
+            <w:proofErr w:type="gramEnd"/>
+          </w:p>
+        </w:tc>
+      </w:tr>
+      <w:tr>
+        <w:tc>
+          <w:tcPr>
+            <w:tcW w:w="2880" w:type="dxa"/>
+            <w:shd w:val="clear" w:color="auto" w:fill="F5F0FF"/>
+          </w:tcPr>
+          <w:p>
+            <w:r>
+              <w:rPr>
+                <w:sz w:val="18"/>
+              </w:rPr>
+              <w:t>Switch model / effort</w:t>
+            </w:r>
+          </w:p>
+        </w:tc>
+        <w:tc>
+          <w:tcPr>
+            <w:tcW w:w="2880" w:type="dxa"/>
+            <w:shd w:val="clear" w:color="auto" w:fill="F5F0FF"/>
+          </w:tcPr>
+          <w:p>
+            <w:r>
+              <w:rPr>
+                <w:sz w:val="18"/>
+              </w:rPr>
+              <w:t>/</w:t>
+            </w:r>
+            <w:proofErr w:type="gramStart"/>
+            <w:r>
+              <w:rPr>
+                <w:sz w:val="18"/>
+              </w:rPr>
+              <w:t>model</w:t>
+            </w:r>
+            <w:proofErr w:type="gramEnd"/>
+          </w:p>
+        </w:tc>
+        <w:tc>
+          <w:tcPr>
+            <w:tcW w:w="2880" w:type="dxa"/>
+            <w:shd w:val="clear" w:color="auto" w:fill="F5F0FF"/>
+          </w:tcPr>
+          <w:p>
+            <w:r>
+              <w:rPr>
+                <w:sz w:val="18"/>
+              </w:rPr>
+              <w:t>/</w:t>
+            </w:r>
+            <w:proofErr w:type="gramStart"/>
+            <w:r>
+              <w:rPr>
+                <w:sz w:val="18"/>
+              </w:rPr>
+              <w:t>model</w:t>
+            </w:r>
+            <w:proofErr w:type="gramEnd"/>
+          </w:p>
+        </w:tc>
+      </w:tr>
+      <w:tr>
+        <w:tc>
+          <w:tcPr>
+            <w:tcW w:w="2880" w:type="dxa"/>
+            <w:shd w:val="clear" w:color="auto" w:fill="FFFFFF"/>
+          </w:tcPr>
+          <w:p>
+            <w:r>
+              <w:rPr>
+                <w:sz w:val="18"/>
+              </w:rPr>
+              <w:t>Plan before touching files</w:t>
+            </w:r>
+          </w:p>
+        </w:tc>
+        <w:tc>
+          <w:tcPr>
+            <w:tcW w:w="2880" w:type="dxa"/>
+            <w:shd w:val="clear" w:color="auto" w:fill="FFFFFF"/>
+          </w:tcPr>
+          <w:p>
+            <w:r>
+              <w:rPr>
+                <w:sz w:val="18"/>
+              </w:rPr>
+              <w:t>Plan Mode (</w:t>
+            </w:r>
+            <w:proofErr w:type="spellStart"/>
+            <w:r>
+              <w:rPr>
+                <w:sz w:val="18"/>
+              </w:rPr>
+              <w:t>Shift+Tab</w:t>
+            </w:r>
+            <w:proofErr w:type="spellEnd"/>
+            <w:r>
+              <w:rPr>
+                <w:sz w:val="18"/>
+              </w:rPr>
+              <w:t>)</w:t>
+            </w:r>
+          </w:p>
+        </w:tc>
+        <w:tc>
+          <w:tcPr>
+            <w:tcW w:w="2880" w:type="dxa"/>
+            <w:shd w:val="clear" w:color="auto" w:fill="FFFFFF"/>
+          </w:tcPr>
+          <w:p>
+            <w:r>
+              <w:rPr>
+                <w:sz w:val="18"/>
+              </w:rPr>
+              <w:t>/</w:t>
+            </w:r>
+            <w:proofErr w:type="gramStart"/>
+            <w:r>
+              <w:rPr>
+                <w:sz w:val="18"/>
+              </w:rPr>
+              <w:t>plan</w:t>
+            </w:r>
+            <w:proofErr w:type="gramEnd"/>
+          </w:p>
+        </w:tc>
+      </w:tr>
+      <w:tr>
+        <w:tc>
+          <w:tcPr>
+            <w:tcW w:w="2880" w:type="dxa"/>
+            <w:shd w:val="clear" w:color="auto" w:fill="F5F0FF"/>
+          </w:tcPr>
+          <w:p>
+            <w:r>
+              <w:rPr>
+                <w:sz w:val="18"/>
+              </w:rPr>
+              <w:t>Set the project contract</w:t>
+            </w:r>
+          </w:p>
+        </w:tc>
+        <w:tc>
+          <w:tcPr>
+            <w:tcW w:w="2880" w:type="dxa"/>
+            <w:shd w:val="clear" w:color="auto" w:fill="F5F0FF"/>
+          </w:tcPr>
+          <w:p>
+            <w:r>
+              <w:rPr>
+                <w:sz w:val="18"/>
+              </w:rPr>
+              <w:t>/</w:t>
+            </w:r>
+            <w:proofErr w:type="spellStart"/>
+            <w:proofErr w:type="gramStart"/>
+            <w:r>
+              <w:rPr>
+                <w:sz w:val="18"/>
+              </w:rPr>
+              <w:t>init</w:t>
+            </w:r>
+            <w:proofErr w:type="spellEnd"/>
+            <w:proofErr w:type="gramEnd"/>
+            <w:r>
+              <w:rPr>
+                <w:sz w:val="18"/>
+              </w:rPr>
+              <w:t xml:space="preserve"> (CLAUDE.md)</w:t>
+            </w:r>
+          </w:p>
+        </w:tc>
+        <w:tc>
+          <w:tcPr>
+            <w:tcW w:w="2880" w:type="dxa"/>
+            <w:shd w:val="clear" w:color="auto" w:fill="F5F0FF"/>
+          </w:tcPr>
+          <w:p>
+            <w:r>
+              <w:rPr>
+                <w:sz w:val="18"/>
+              </w:rPr>
+              <w:t>/</w:t>
+            </w:r>
+            <w:proofErr w:type="spellStart"/>
+            <w:proofErr w:type="gramStart"/>
+            <w:r>
+              <w:rPr>
+                <w:sz w:val="18"/>
+              </w:rPr>
+              <w:t>init</w:t>
+            </w:r>
+            <w:proofErr w:type="spellEnd"/>
+            <w:proofErr w:type="gramEnd"/>
+            <w:r>
+              <w:rPr>
+                <w:sz w:val="18"/>
+              </w:rPr>
+              <w:t xml:space="preserve"> (AGENTS.md)</w:t>
+            </w:r>
+          </w:p>
+        </w:tc>
+      </w:tr>
+      <w:tr>
+        <w:tc>
+          <w:tcPr>
+            <w:tcW w:w="2880" w:type="dxa"/>
+            <w:shd w:val="clear" w:color="auto" w:fill="FFFFFF"/>
+          </w:tcPr>
+          <w:p>
+            <w:r>
+              <w:rPr>
+                <w:sz w:val="18"/>
+              </w:rPr>
+              <w:t>Review a diff</w:t>
+            </w:r>
+          </w:p>
+        </w:tc>
+        <w:tc>
+          <w:tcPr>
+            <w:tcW w:w="2880" w:type="dxa"/>
+            <w:shd w:val="clear" w:color="auto" w:fill="FFFFFF"/>
+          </w:tcPr>
+          <w:p>
+            <w:r>
+              <w:rPr>
+                <w:sz w:val="18"/>
+              </w:rPr>
+              <w:t>/</w:t>
+            </w:r>
+            <w:proofErr w:type="gramStart"/>
+            <w:r>
+              <w:rPr>
+                <w:sz w:val="18"/>
+              </w:rPr>
+              <w:t>review</w:t>
+            </w:r>
+            <w:proofErr w:type="gramEnd"/>
+          </w:p>
+        </w:tc>
+        <w:tc>
+          <w:tcPr>
+            <w:tcW w:w="2880" w:type="dxa"/>
+            <w:shd w:val="clear" w:color="auto" w:fill="FFFFFF"/>
+          </w:tcPr>
+          <w:p>
+            <w:r>
+              <w:rPr>
+                <w:sz w:val="18"/>
+              </w:rPr>
+              <w:t>/</w:t>
+            </w:r>
+            <w:proofErr w:type="gramStart"/>
+            <w:r>
+              <w:rPr>
+                <w:sz w:val="18"/>
+              </w:rPr>
+              <w:t>review</w:t>
+            </w:r>
+            <w:proofErr w:type="gramEnd"/>
+          </w:p>
+        </w:tc>
+      </w:tr>
+      <w:tr>
+        <w:tc>
+          <w:tcPr>
+            <w:tcW w:w="2880" w:type="dxa"/>
+            <w:shd w:val="clear" w:color="auto" w:fill="F5F0FF"/>
+          </w:tcPr>
+          <w:p>
+            <w:r>
+              <w:rPr>
+                <w:sz w:val="18"/>
+              </w:rPr>
+              <w:t>See the git diff</w:t>
+            </w:r>
+          </w:p>
+        </w:tc>
+        <w:tc>
+          <w:tcPr>
+            <w:tcW w:w="2880" w:type="dxa"/>
+            <w:shd w:val="clear" w:color="auto" w:fill="F5F0FF"/>
+          </w:tcPr>
+          <w:p>
+            <w:r>
+              <w:rPr>
+                <w:sz w:val="18"/>
+              </w:rPr>
+              <w:t>/</w:t>
+            </w:r>
+            <w:proofErr w:type="gramStart"/>
+            <w:r>
+              <w:rPr>
+                <w:sz w:val="18"/>
+              </w:rPr>
+              <w:t>review</w:t>
+            </w:r>
+            <w:proofErr w:type="gramEnd"/>
+            <w:r>
+              <w:rPr>
+                <w:sz w:val="18"/>
+              </w:rPr>
+              <w:t xml:space="preserve"> (inline)</w:t>
+            </w:r>
+          </w:p>
+        </w:tc>
+        <w:tc>
+          <w:tcPr>
+            <w:tcW w:w="2880" w:type="dxa"/>
+            <w:shd w:val="clear" w:color="auto" w:fill="F5F0FF"/>
+          </w:tcPr>
+          <w:p>
+            <w:r>
+              <w:rPr>
+                <w:sz w:val="18"/>
+              </w:rPr>
+              <w:t>/</w:t>
+            </w:r>
+            <w:proofErr w:type="gramStart"/>
+            <w:r>
+              <w:rPr>
+                <w:sz w:val="18"/>
+              </w:rPr>
+              <w:t>diff</w:t>
+            </w:r>
+            <w:proofErr w:type="gramEnd"/>
+          </w:p>
+        </w:tc>
+      </w:tr>
+      <w:tr>
+        <w:tc>
+          <w:tcPr>
+            <w:tcW w:w="2880" w:type="dxa"/>
+            <w:shd w:val="clear" w:color="auto" w:fill="FFFFFF"/>
+          </w:tcPr>
+          <w:p>
+            <w:r>
+              <w:rPr>
+                <w:sz w:val="18"/>
+              </w:rPr>
+              <w:t>MCP servers</w:t>
+            </w:r>
+          </w:p>
+        </w:tc>
+        <w:tc>
+          <w:tcPr>
+            <w:tcW w:w="2880" w:type="dxa"/>
+            <w:shd w:val="clear" w:color="auto" w:fill="FFFFFF"/>
+          </w:tcPr>
+          <w:p>
+            <w:r>
+              <w:rPr>
+                <w:sz w:val="18"/>
+              </w:rPr>
+              <w:t>/</w:t>
+            </w:r>
+            <w:proofErr w:type="spellStart"/>
+            <w:proofErr w:type="gramStart"/>
+            <w:r>
+              <w:rPr>
+                <w:sz w:val="18"/>
+              </w:rPr>
+              <w:t>mcp</w:t>
+            </w:r>
+            <w:proofErr w:type="spellEnd"/>
+            <w:proofErr w:type="gramEnd"/>
+          </w:p>
+        </w:tc>
+        <w:tc>
+          <w:tcPr>
+            <w:tcW w:w="2880" w:type="dxa"/>
+            <w:shd w:val="clear" w:color="auto" w:fill="FFFFFF"/>
+          </w:tcPr>
+          <w:p>
+            <w:r>
+              <w:rPr>
+                <w:sz w:val="18"/>
+              </w:rPr>
+              <w:t>/</w:t>
+            </w:r>
+            <w:proofErr w:type="spellStart"/>
+            <w:proofErr w:type="gramStart"/>
+            <w:r>
+              <w:rPr>
+                <w:sz w:val="18"/>
+              </w:rPr>
+              <w:t>mcp</w:t>
+            </w:r>
+            <w:proofErr w:type="spellEnd"/>
+            <w:proofErr w:type="gramEnd"/>
+          </w:p>
+        </w:tc>
+      </w:tr>
+      <w:tr>
+        <w:tc>
+          <w:tcPr>
+            <w:tcW w:w="2880" w:type="dxa"/>
+            <w:shd w:val="clear" w:color="auto" w:fill="F5F0FF"/>
+          </w:tcPr>
+          <w:p>
+            <w:r>
+              <w:rPr>
+                <w:sz w:val="18"/>
+              </w:rPr>
+              <w:t>Approvals / sandbox</w:t>
+            </w:r>
+          </w:p>
+        </w:tc>
+        <w:tc>
+          <w:tcPr>
+            <w:tcW w:w="2880" w:type="dxa"/>
+            <w:shd w:val="clear" w:color="auto" w:fill="F5F0FF"/>
+          </w:tcPr>
+          <w:p>
+            <w:r>
+              <w:rPr>
+                <w:sz w:val="18"/>
+              </w:rPr>
+              <w:t>toggle (</w:t>
+            </w:r>
+            <w:proofErr w:type="spellStart"/>
+            <w:r>
+              <w:rPr>
+                <w:sz w:val="18"/>
+              </w:rPr>
+              <w:t>Shift+Tab</w:t>
+            </w:r>
+            <w:proofErr w:type="spellEnd"/>
+            <w:r>
+              <w:rPr>
+                <w:sz w:val="18"/>
+              </w:rPr>
+              <w:t>)</w:t>
+            </w:r>
+          </w:p>
+        </w:tc>
+        <w:tc>
+          <w:tcPr>
+            <w:tcW w:w="2880" w:type="dxa"/>
+            <w:shd w:val="clear" w:color="auto" w:fill="F5F0FF"/>
+          </w:tcPr>
+          <w:p>
+            <w:r>
+              <w:rPr>
+                <w:sz w:val="18"/>
+              </w:rPr>
+              <w:t>/</w:t>
+            </w:r>
+            <w:proofErr w:type="gramStart"/>
+            <w:r>
+              <w:rPr>
+                <w:sz w:val="18"/>
+              </w:rPr>
+              <w:t>approvals</w:t>
+            </w:r>
+            <w:proofErr w:type="gramEnd"/>
+          </w:p>
+        </w:tc>
+      </w:tr>
+      <w:tr>
+        <w:tc>
+          <w:tcPr>
+            <w:tcW w:w="2880" w:type="dxa"/>
+            <w:shd w:val="clear" w:color="auto" w:fill="FFFFFF"/>
+          </w:tcPr>
+          <w:p>
+            <w:r>
+              <w:rPr>
+                <w:sz w:val="18"/>
+              </w:rPr>
+              <w:t>Sub-agents</w:t>
+            </w:r>
+          </w:p>
+        </w:tc>
+        <w:tc>
+          <w:tcPr>
+            <w:tcW w:w="2880" w:type="dxa"/>
+            <w:shd w:val="clear" w:color="auto" w:fill="FFFFFF"/>
+          </w:tcPr>
+          <w:p>
+            <w:r>
+              <w:rPr>
+                <w:sz w:val="18"/>
+              </w:rPr>
+              <w:t>/</w:t>
+            </w:r>
+            <w:proofErr w:type="gramStart"/>
+            <w:r>
+              <w:rPr>
+                <w:sz w:val="18"/>
+              </w:rPr>
+              <w:t>agents</w:t>
+            </w:r>
+            <w:proofErr w:type="gramEnd"/>
+          </w:p>
+        </w:tc>
+        <w:tc>
+          <w:tcPr>
+            <w:tcW w:w="2880" w:type="dxa"/>
+            <w:shd w:val="clear" w:color="auto" w:fill="FFFFFF"/>
+          </w:tcPr>
+          <w:p>
+            <w:r>
+              <w:rPr>
+                <w:sz w:val="18"/>
+              </w:rPr>
+              <w:t>.codex/agents/*.</w:t>
+            </w:r>
+            <w:proofErr w:type="spellStart"/>
+            <w:r>
+              <w:rPr>
+                <w:sz w:val="18"/>
+              </w:rPr>
+              <w:t>toml</w:t>
+            </w:r>
+            <w:proofErr w:type="spellEnd"/>
+          </w:p>
+        </w:tc>
+      </w:tr>
+      <w:tr>
+        <w:tc>
+          <w:tcPr>
+            <w:tcW w:w="2880" w:type="dxa"/>
+            <w:shd w:val="clear" w:color="auto" w:fill="F5F0FF"/>
+          </w:tcPr>
+          <w:p>
+            <w:r>
+              <w:rPr>
+                <w:sz w:val="18"/>
+              </w:rPr>
+              <w:t>Undo in-session</w:t>
+            </w:r>
+          </w:p>
+        </w:tc>
+        <w:tc>
+          <w:tcPr>
+            <w:tcW w:w="2880" w:type="dxa"/>
+            <w:shd w:val="clear" w:color="auto" w:fill="F5F0FF"/>
+          </w:tcPr>
+          <w:p>
+            <w:r>
+              <w:rPr>
+                <w:sz w:val="18"/>
+              </w:rPr>
+              <w:t>/</w:t>
+            </w:r>
+            <w:proofErr w:type="gramStart"/>
+            <w:r>
+              <w:rPr>
+                <w:sz w:val="18"/>
+              </w:rPr>
+              <w:t>rewind</w:t>
+            </w:r>
+            <w:proofErr w:type="gramEnd"/>
+            <w:r>
+              <w:rPr>
+                <w:sz w:val="18"/>
+              </w:rPr>
+              <w:t xml:space="preserve"> (Esc Esc)</w:t>
+            </w:r>
+          </w:p>
+        </w:tc>
+        <w:tc>
+          <w:tcPr>
+            <w:tcW w:w="2880" w:type="dxa"/>
+            <w:shd w:val="clear" w:color="auto" w:fill="F5F0FF"/>
+          </w:tcPr>
+          <w:p>
+            <w:r>
+              <w:rPr>
+                <w:sz w:val="18"/>
+              </w:rPr>
+              <w:t>git + resume</w:t>
+            </w:r>
+          </w:p>
+        </w:tc>
+      </w:tr>
+      <w:tr>
+        <w:tc>
+          <w:tcPr>
+            <w:tcW w:w="2880" w:type="dxa"/>
+            <w:shd w:val="clear" w:color="auto" w:fill="FFFFFF"/>
+          </w:tcPr>
+          <w:p>
+            <w:r>
+              <w:rPr>
+                <w:sz w:val="18"/>
+              </w:rPr>
+              <w:t>Security review</w:t>
+            </w:r>
+          </w:p>
+        </w:tc>
+        <w:tc>
+          <w:tcPr>
+            <w:tcW w:w="2880" w:type="dxa"/>
+            <w:shd w:val="clear" w:color="auto" w:fill="FFFFFF"/>
+          </w:tcPr>
+          <w:p>
+            <w:r>
+              <w:rPr>
+                <w:sz w:val="18"/>
+              </w:rPr>
+              <w:t>/</w:t>
+            </w:r>
+            <w:proofErr w:type="gramStart"/>
+            <w:r>
+              <w:rPr>
+                <w:sz w:val="18"/>
+              </w:rPr>
+              <w:t>security</w:t>
+            </w:r>
+            <w:proofErr w:type="gramEnd"/>
+            <w:r>
+              <w:rPr>
+                <w:sz w:val="18"/>
+              </w:rPr>
+              <w:t>-review</w:t>
+            </w:r>
+          </w:p>
+        </w:tc>
+        <w:tc>
+          <w:tcPr>
+            <w:tcW w:w="2880" w:type="dxa"/>
+            <w:shd w:val="clear" w:color="auto" w:fill="FFFFFF"/>
+          </w:tcPr>
+          <w:p>
+            <w:r>
+              <w:rPr>
+                <w:sz w:val="18"/>
+              </w:rPr>
+              <w:t>/review + prompt</w:t>
+            </w:r>
+          </w:p>
+        </w:tc>
+      </w:tr>
+      <w:tr>
+        <w:tc>
+          <w:tcPr>
+            <w:tcW w:w="2880" w:type="dxa"/>
+            <w:shd w:val="clear" w:color="auto" w:fill="F5F0FF"/>
+          </w:tcPr>
+          <w:p>
+            <w:r>
+              <w:rPr>
+                <w:sz w:val="18"/>
+              </w:rPr>
+              <w:t>Reusable command</w:t>
+            </w:r>
+          </w:p>
+        </w:tc>
+        <w:tc>
+          <w:tcPr>
+            <w:tcW w:w="2880" w:type="dxa"/>
+            <w:shd w:val="clear" w:color="auto" w:fill="F5F0FF"/>
+          </w:tcPr>
+          <w:p>
+            <w:r>
+              <w:rPr>
+                <w:sz w:val="18"/>
+              </w:rPr>
+              <w:t>/</w:t>
+            </w:r>
+            <w:proofErr w:type="gramStart"/>
+            <w:r>
+              <w:rPr>
+                <w:sz w:val="18"/>
+              </w:rPr>
+              <w:t>name</w:t>
+            </w:r>
+            <w:proofErr w:type="gramEnd"/>
+            <w:r>
+              <w:rPr>
+                <w:sz w:val="18"/>
+              </w:rPr>
+              <w:t xml:space="preserve"> </w:t>
+            </w:r>
+            <w:proofErr w:type="gramStart"/>
+            <w:r>
+              <w:rPr>
+                <w:sz w:val="18"/>
+              </w:rPr>
+              <w:t>(.</w:t>
+            </w:r>
+            <w:proofErr w:type="spellStart"/>
+            <w:r>
+              <w:rPr>
+                <w:sz w:val="18"/>
+              </w:rPr>
+              <w:t>claude</w:t>
+            </w:r>
+            <w:proofErr w:type="spellEnd"/>
+            <w:proofErr w:type="gramEnd"/>
+            <w:r>
+              <w:rPr>
+                <w:sz w:val="18"/>
+              </w:rPr>
+              <w:t>/commands/)</w:t>
+            </w:r>
+          </w:p>
+        </w:tc>
+        <w:tc>
+          <w:tcPr>
+            <w:tcW w:w="2880" w:type="dxa"/>
+            <w:shd w:val="clear" w:color="auto" w:fill="F5F0FF"/>
+          </w:tcPr>
+          <w:p>
+            <w:r>
+              <w:rPr>
+                <w:sz w:val="18"/>
+              </w:rPr>
+              <w:t>/</w:t>
+            </w:r>
+            <w:proofErr w:type="gramStart"/>
+            <w:r>
+              <w:rPr>
+                <w:sz w:val="18"/>
+              </w:rPr>
+              <w:t>name</w:t>
+            </w:r>
+            <w:proofErr w:type="gramEnd"/>
+            <w:r>
+              <w:rPr>
+                <w:sz w:val="18"/>
+              </w:rPr>
+              <w:t xml:space="preserve"> (~</w:t>
+            </w:r>
+            <w:proofErr w:type="gramStart"/>
+            <w:r>
+              <w:rPr>
+                <w:sz w:val="18"/>
+              </w:rPr>
+              <w:t>/.codex</w:t>
+            </w:r>
+            <w:proofErr w:type="gramEnd"/>
+            <w:r>
+              <w:rPr>
+                <w:sz w:val="18"/>
+              </w:rPr>
+              <w:t>/prompts/)</w:t>
+            </w:r>
+          </w:p>
+        </w:tc>
+      </w:tr>
+      <w:tr>
+        <w:tc>
+          <w:tcPr>
+            <w:tcW w:w="2880" w:type="dxa"/>
+            <w:shd w:val="clear" w:color="auto" w:fill="FFFFFF"/>
+          </w:tcPr>
+          <w:p>
+            <w:r>
+              <w:rPr>
+                <w:sz w:val="18"/>
+              </w:rPr>
+              <w:t>Headless (CI)</w:t>
+            </w:r>
+          </w:p>
+        </w:tc>
+        <w:tc>
+          <w:tcPr>
+            <w:tcW w:w="2880" w:type="dxa"/>
+            <w:shd w:val="clear" w:color="auto" w:fill="FFFFFF"/>
+          </w:tcPr>
+          <w:p>
+            <w:proofErr w:type="spellStart"/>
+            <w:r>
+              <w:rPr>
+                <w:sz w:val="18"/>
+              </w:rPr>
+              <w:t>claude</w:t>
+            </w:r>
+            <w:proofErr w:type="spellEnd"/>
+            <w:r>
+              <w:rPr>
+                <w:sz w:val="18"/>
+              </w:rPr>
+              <w:t xml:space="preserve"> -p "..."</w:t>
+            </w:r>
+          </w:p>
+        </w:tc>
+        <w:tc>
+          <w:tcPr>
+            <w:tcW w:w="2880" w:type="dxa"/>
+            <w:shd w:val="clear" w:color="auto" w:fill="FFFFFF"/>
+          </w:tcPr>
+          <w:p>
+            <w:r>
+              <w:rPr>
+                <w:sz w:val="18"/>
+              </w:rPr>
+              <w:t>codex exec "..."</w:t>
+            </w:r>
+          </w:p>
+        </w:tc>
+      </w:tr>
+      <w:tr>
+        <w:tc>
+          <w:tcPr>
+            <w:tcW w:w="2880" w:type="dxa"/>
+            <w:shd w:val="clear" w:color="auto" w:fill="F5F0FF"/>
+          </w:tcPr>
+          <w:p>
+            <w:r>
+              <w:rPr>
+                <w:sz w:val="18"/>
+              </w:rPr>
+              <w:t>Pin a file into context</w:t>
+            </w:r>
+          </w:p>
+        </w:tc>
+        <w:tc>
+          <w:tcPr>
+            <w:tcW w:w="2880" w:type="dxa"/>
+            <w:shd w:val="clear" w:color="auto" w:fill="F5F0FF"/>
+          </w:tcPr>
+          <w:p>
+            <w:r>
+              <w:rPr>
+                <w:sz w:val="18"/>
+              </w:rPr>
+              <w:t>@path/to/file</w:t>
+            </w:r>
+          </w:p>
+        </w:tc>
+        <w:tc>
+          <w:tcPr>
+            <w:tcW w:w="2880" w:type="dxa"/>
+            <w:shd w:val="clear" w:color="auto" w:fill="F5F0FF"/>
+          </w:tcPr>
+          <w:p>
+            <w:r>
+              <w:rPr>
+                <w:sz w:val="18"/>
+              </w:rPr>
+              <w:t>@path/to/file</w:t>
+            </w:r>
+          </w:p>
+        </w:tc>
+      </w:tr>
+      <w:tr>
+        <w:tc>
+          <w:tcPr>
+            <w:tcW w:w="2880" w:type="dxa"/>
+            <w:shd w:val="clear" w:color="auto" w:fill="FFFFFF"/>
+          </w:tcPr>
+          <w:p>
+            <w:r>
+              <w:rPr>
+                <w:sz w:val="18"/>
+              </w:rPr>
+              <w:t>Help</w:t>
+            </w:r>
+          </w:p>
+        </w:tc>
+        <w:tc>
+          <w:tcPr>
+            <w:tcW w:w="2880" w:type="dxa"/>
+            <w:shd w:val="clear" w:color="auto" w:fill="FFFFFF"/>
+          </w:tcPr>
+          <w:p>
+            <w:r>
+              <w:rPr>
+                <w:sz w:val="18"/>
+              </w:rPr>
+              <w:t>/</w:t>
+            </w:r>
+            <w:proofErr w:type="gramStart"/>
+            <w:r>
+              <w:rPr>
+                <w:sz w:val="18"/>
+              </w:rPr>
+              <w:t>help</w:t>
+            </w:r>
+            <w:proofErr w:type="gramEnd"/>
+          </w:p>
+        </w:tc>
+        <w:tc>
+          <w:tcPr>
+            <w:tcW w:w="2880" w:type="dxa"/>
+            <w:shd w:val="clear" w:color="auto" w:fill="FFFFFF"/>
+          </w:tcPr>
+          <w:p>
+            <w:r>
+              <w:rPr>
+                <w:sz w:val="18"/>
+              </w:rPr>
+              <w:t>/</w:t>
+            </w:r>
+            <w:proofErr w:type="gramStart"/>
+            <w:r>
+              <w:rPr>
+                <w:sz w:val="18"/>
+              </w:rPr>
+              <w:t>help</w:t>
+            </w:r>
+            <w:proofErr w:type="gramEnd"/>
           </w:p>
         </w:tc>
       </w:tr>
@@ -4099,6 +5114,7 @@
           <w:spacing w:val="6"/>
           <w:sz w:val="16"/>
         </w:rPr>
+        <w:lastRenderedPageBreak/>
         <w:t>PROMPT  (</w:t>
       </w:r>
       <w:proofErr w:type="gramEnd"/>
@@ -4431,7 +5447,6 @@
         <w:pStyle w:val="Heading3"/>
       </w:pPr>
       <w:r>
-        <w:lastRenderedPageBreak/>
         <w:t>Block B: make it run and react (20 min)</w:t>
       </w:r>
     </w:p>
@@ -4768,6 +5783,7 @@
         <w:spacing w:after="200" w:line="276" w:lineRule="auto"/>
       </w:pPr>
       <w:r>
+        <w:lastRenderedPageBreak/>
         <w:t>“You just shipped without writing a line.” If the agent lacks git permission, the equivalent by hand is:</w:t>
       </w:r>
     </w:p>
@@ -4926,7 +5942,6 @@
         <w:rPr>
           <w:b/>
         </w:rPr>
-        <w:lastRenderedPageBreak/>
         <w:t>Bridge to Section 2</w:t>
       </w:r>
       <w:proofErr w:type="gramStart"/>

</xml_diff>